<commit_message>
Ouvrir / Enregistrer (fichier .infralab.json, dossier choisi), bouton Aide, présentation et crédit auteur
Co-Authored-By: Claude Sonnet 5.5 <noreply@anthropic.com>
Claude-Session: https://claude.ai/code/session_01VfiaANKi6S4GKurjVjjf4W
</commit_message>
<xml_diff>
--- a/docs/livrets/InfraLab-Livret-eleve.docx
+++ b/docs/livrets/InfraLab-Livret-eleve.docx
@@ -1256,6 +1256,26 @@
             </w:r>
             <w:r>
               <w:t xml:space="preserve">, avec vos mots.</w:t>
+            </w:r>
+          </w:p>
+          <w:p>
+            <w:pPr>
+              <w:pStyle w:val="ListParagraph"/>
+              <w:numPr>
+                <w:ilvl w:val="0"/>
+                <w:numId w:val="2"/>
+              </w:numPr>
+              <w:spacing w:after="60" w:line="276"/>
+            </w:pPr>
+            <w:r>
+              <w:rPr>
+                <w:b/>
+                <w:bCs/>
+              </w:rPr>
+              <w:t xml:space="preserve">Enregistrer</w:t>
+            </w:r>
+            <w:r>
+              <w:t xml:space="preserve"> votre travail avec le bouton « Enregistrer » (Ctrl+S) dans le dossier de votre choix, et le rouvrir plus tard avec « Ouvrir » (Ctrl+O) : le TP reprend où vous l'avez laissé. Le bouton « ? Aide » résume tout cela.</w:t>
             </w:r>
           </w:p>
           <w:p>

</xml_diff>

<commit_message>
Le temps compte : horloge dans les TP, calendrier ouvré, groupes, délégations, VM ↔ hyperviseur
- Encart « Dans ce TP, le temps compte » et chronologie scénarisée (tickets/pannes à heure fixe)
- SLA : calendrier continu ou heures ouvrées (page Paramètres, droit admin.settings)
- Machines virtuelles rattachées à leur hyperviseur (host_down, relation « hébergé sur »)
- Groupes (rôles hérités, file d'attente des tickets) et délégations à durée limitée
- 6 nouveaux TP (41 à 46), 321 tests, aide, guide formateur et livrets mis à jour

Co-Authored-By: Claude Sonnet 5.5 <noreply@anthropic.com>
Claude-Session: https://claude.ai/code/session_01VfiaANKi6S4GKurjVjjf4W
</commit_message>
<xml_diff>
--- a/docs/livrets/InfraLab-Livret-eleve.docx
+++ b/docs/livrets/InfraLab-Livret-eleve.docx
@@ -605,7 +605,7 @@
           <w:sz w:val="24"/>
           <w:szCs w:val="24"/>
         </w:rPr>
-        <w:t xml:space="preserve">Partie 3 — Fiches TP (TP 1 à 40)</w:t>
+        <w:t xml:space="preserve">Partie 3 — Fiches TP (TP 1 à 46)</w:t>
       </w:r>
     </w:p>
     <w:p>
@@ -652,7 +652,7 @@
         <w:t xml:space="preserve">InfraLab</w:t>
       </w:r>
       <w:r>
-        <w:t xml:space="preserve">. Le simulateur contient 40 TP guidés ; ce livret ajoute </w:t>
+        <w:t xml:space="preserve">. Le simulateur contient 46 TP guidés ; ce livret ajoute </w:t>
       </w:r>
       <w:r>
         <w:rPr>
@@ -1025,7 +1025,7 @@
               <w:spacing w:after="40" w:before="0" w:line="276"/>
             </w:pPr>
             <w:r>
-              <w:t xml:space="preserve">Une fiche par TP (40) : objectifs, question de transfert, journal</w:t>
+              <w:t xml:space="preserve">Une fiche par TP (46) : objectifs, question de transfert, journal</w:t>
             </w:r>
           </w:p>
         </w:tc>
@@ -1256,6 +1256,29 @@
             </w:r>
             <w:r>
               <w:t xml:space="preserve">, avec vos mots.</w:t>
+            </w:r>
+          </w:p>
+          <w:p>
+            <w:pPr>
+              <w:pStyle w:val="ListParagraph"/>
+              <w:numPr>
+                <w:ilvl w:val="0"/>
+                <w:numId w:val="2"/>
+              </w:numPr>
+              <w:spacing w:after="60" w:line="276"/>
+            </w:pPr>
+            <w:r>
+              <w:t xml:space="preserve">Dans les TP où le </w:t>
+            </w:r>
+            <w:r>
+              <w:rPr>
+                <w:b/>
+                <w:bCs/>
+              </w:rPr>
+              <w:t xml:space="preserve">temps compte</w:t>
+            </w:r>
+            <w:r>
+              <w:t xml:space="preserve"> (encart « Horloge »), c'est vous qui faites avancer l'horloge simulée : +15 min, +1 h ou +1 jour.</w:t>
             </w:r>
           </w:p>
           <w:p>
@@ -3348,7 +3371,7 @@
           <w:iCs/>
           <w:color w:val="595959"/>
         </w:rPr>
-        <w:t xml:space="preserve">TP associés : TP 11 à 15.</w:t>
+        <w:t xml:space="preserve">TP associés : TP 11 à 15, 42.</w:t>
       </w:r>
     </w:p>
     <w:p>
@@ -4197,7 +4220,7 @@
           <w:iCs/>
           <w:color w:val="595959"/>
         </w:rPr>
-        <w:t xml:space="preserve">TP associés : TP 16 à 20.</w:t>
+        <w:t xml:space="preserve">TP associés : TP 16 à 20, 43.</w:t>
       </w:r>
     </w:p>
     <w:p>
@@ -4206,6 +4229,60 @@
       </w:pPr>
       <w:r>
         <w:t xml:space="preserve">Face à une panne, le réflexe n'est pas de cliquer partout : c'est de raisonner du plus simple au plus complexe, et de chercher ce qui est commun.</w:t>
+      </w:r>
+    </w:p>
+    <w:p>
+      <w:pPr>
+        <w:pStyle w:val="Heading2"/>
+        <w:keepNext/>
+      </w:pPr>
+      <w:r>
+        <w:t xml:space="preserve">4.0 Quand une panne arrive avec le temps</w:t>
+      </w:r>
+    </w:p>
+    <w:p>
+      <w:pPr>
+        <w:spacing w:after="120" w:before="0" w:line="276"/>
+      </w:pPr>
+      <w:r>
+        <w:t xml:space="preserve">Une panne ne s'annonce pas : elle survient, puis les appels arrivent, souvent à quelques minutes d'intervalle. Dans les TP où le </w:t>
+      </w:r>
+      <w:r>
+        <w:rPr>
+          <w:b/>
+          <w:bCs/>
+        </w:rPr>
+        <w:t xml:space="preserve">temps compte</w:t>
+      </w:r>
+      <w:r>
+        <w:t xml:space="preserve">, l'horloge simulée n'avance que lorsque vous la faites avancer (+15 min, +1 h, +1 jour) : c'est vous qui laissez venir la situation. Une </w:t>
+      </w:r>
+      <w:r>
+        <w:rPr>
+          <w:b/>
+          <w:bCs/>
+        </w:rPr>
+        <w:t xml:space="preserve">machine virtuelle</w:t>
+      </w:r>
+      <w:r>
+        <w:t xml:space="preserve"> s'exécute sur un </w:t>
+      </w:r>
+      <w:r>
+        <w:rPr>
+          <w:b/>
+          <w:bCs/>
+        </w:rPr>
+        <w:t xml:space="preserve">hyperviseur</w:t>
+      </w:r>
+      <w:r>
+        <w:t xml:space="preserve"> : si l'hôte s'arrête, toutes ses VM s'arrêtent avec lui. Deux applications en panne en même temps appellent donc la question : </w:t>
+      </w:r>
+      <w:r>
+        <w:rPr>
+          <w:i/>
+          <w:iCs/>
+        </w:rPr>
+        <w:t xml:space="preserve">qu'ont-elles en commun ?</w:t>
       </w:r>
     </w:p>
     <w:p>
@@ -4523,7 +4600,7 @@
           <w:iCs/>
           <w:color w:val="595959"/>
         </w:rPr>
-        <w:t xml:space="preserve">TP associés : TP 22 à 25.</w:t>
+        <w:t xml:space="preserve">TP associés : TP 22 à 25, 41, 44.</w:t>
       </w:r>
     </w:p>
     <w:p>
@@ -5072,6 +5149,44 @@
     </w:p>
     <w:p>
       <w:pPr>
+        <w:spacing w:after="120" w:before="0" w:line="276"/>
+      </w:pPr>
+      <w:r>
+        <w:t xml:space="preserve">Le SLA se mesure sur un </w:t>
+      </w:r>
+      <w:r>
+        <w:rPr>
+          <w:b/>
+          <w:bCs/>
+        </w:rPr>
+        <w:t xml:space="preserve">calendrier</w:t>
+      </w:r>
+      <w:r>
+        <w:t xml:space="preserve"> : en </w:t>
+      </w:r>
+      <w:r>
+        <w:rPr>
+          <w:b/>
+          <w:bCs/>
+        </w:rPr>
+        <w:t xml:space="preserve">continu</w:t>
+      </w:r>
+      <w:r>
+        <w:t xml:space="preserve"> (24 h / 24, 7 j / 7) ou en </w:t>
+      </w:r>
+      <w:r>
+        <w:rPr>
+          <w:b/>
+          <w:bCs/>
+        </w:rPr>
+        <w:t xml:space="preserve">heures ouvrées</w:t>
+      </w:r>
+      <w:r>
+        <w:t xml:space="preserve"> (ici du lundi au vendredi, de 8 h à 18 h). Un ticket ouvert vendredi à 17 h est « dépassé » lundi matin en calendrier continu, alors que le service desk n'a travaillé qu'une heure. Le calendrier doit refléter ce que le contrat promet ; le changer corrige la mesure, pas le retard.</w:t>
+      </w:r>
+    </w:p>
+    <w:p>
+      <w:pPr>
         <w:pStyle w:val="Heading2"/>
         <w:keepNext/>
       </w:pPr>
@@ -5222,6 +5337,63 @@
       </w:r>
       <w:r>
         <w:t xml:space="preserve"> → clôture. Le but n'est pas de ralentir, mais d'éviter qu'une modification bien intentionnée provoque un incident.</w:t>
+      </w:r>
+    </w:p>
+    <w:p>
+      <w:pPr>
+        <w:pStyle w:val="Heading2"/>
+        <w:keepNext/>
+      </w:pPr>
+      <w:r>
+        <w:t xml:space="preserve">5.3bis Planifier un changement dans le temps</w:t>
+      </w:r>
+    </w:p>
+    <w:p>
+      <w:pPr>
+        <w:spacing w:after="120" w:before="0" w:line="276"/>
+      </w:pPr>
+      <w:r>
+        <w:t xml:space="preserve">Un changement approuvé est </w:t>
+      </w:r>
+      <w:r>
+        <w:rPr>
+          <w:b/>
+          <w:bCs/>
+        </w:rPr>
+        <w:t xml:space="preserve">planifié</w:t>
+      </w:r>
+      <w:r>
+        <w:t xml:space="preserve"> à une date, souvent </w:t>
+      </w:r>
+      <w:r>
+        <w:rPr>
+          <w:b/>
+          <w:bCs/>
+        </w:rPr>
+        <w:t xml:space="preserve">hors des heures ouvrées</w:t>
+      </w:r>
+      <w:r>
+        <w:t xml:space="preserve"> pour limiter l'impact. Quand l'élément touché héberge d'autres services (un hyperviseur et ses machines virtuelles), on </w:t>
+      </w:r>
+      <w:r>
+        <w:rPr>
+          <w:b/>
+          <w:bCs/>
+        </w:rPr>
+        <w:t xml:space="preserve">déplace d'abord</w:t>
+      </w:r>
+      <w:r>
+        <w:t xml:space="preserve"> ce qui doit rester disponible, </w:t>
+      </w:r>
+      <w:r>
+        <w:rPr>
+          <w:b/>
+          <w:bCs/>
+        </w:rPr>
+        <w:t xml:space="preserve">puis</w:t>
+      </w:r>
+      <w:r>
+        <w:t xml:space="preserve"> on intervient. Le dossier garde la trace du résultat après vérification.</w:t>
       </w:r>
     </w:p>
     <w:p>
@@ -6097,7 +6269,7 @@
           <w:iCs/>
           <w:color w:val="595959"/>
         </w:rPr>
-        <w:t xml:space="preserve">TP associés : TP 33 à 37, 39, 40.</w:t>
+        <w:t xml:space="preserve">TP associés : TP 33 à 37, 39, 40, 45, 46.</w:t>
       </w:r>
     </w:p>
     <w:p>
@@ -6421,6 +6593,100 @@
       </w:r>
       <w:r>
         <w:t xml:space="preserve"> au regard de son rôle, de corriger, et de décider de la mesure pour éviter la récidive.</w:t>
+      </w:r>
+    </w:p>
+    <w:p>
+      <w:pPr>
+        <w:pStyle w:val="Heading2"/>
+        <w:keepNext/>
+      </w:pPr>
+      <w:r>
+        <w:t xml:space="preserve">8.6 Groupes et héritage de rôles</w:t>
+      </w:r>
+    </w:p>
+    <w:p>
+      <w:pPr>
+        <w:spacing w:after="120" w:before="0" w:line="276"/>
+      </w:pPr>
+      <w:r>
+        <w:t xml:space="preserve">Un </w:t>
+      </w:r>
+      <w:r>
+        <w:rPr>
+          <w:b/>
+          <w:bCs/>
+        </w:rPr>
+        <w:t xml:space="preserve">groupe</w:t>
+      </w:r>
+      <w:r>
+        <w:t xml:space="preserve"> rassemble des personnes qui exercent le même métier (« Support N1 »). On donne des </w:t>
+      </w:r>
+      <w:r>
+        <w:rPr>
+          <w:b/>
+          <w:bCs/>
+        </w:rPr>
+        <w:t xml:space="preserve">rôles au groupe</w:t>
+      </w:r>
+      <w:r>
+        <w:t xml:space="preserve"> ; chaque membre les </w:t>
+      </w:r>
+      <w:r>
+        <w:rPr>
+          <w:b/>
+          <w:bCs/>
+        </w:rPr>
+        <w:t xml:space="preserve">hérite</w:t>
+      </w:r>
+      <w:r>
+        <w:t xml:space="preserve">, sans que son compte personnel change. L'arrivée, le départ et la mutation d'une équipe se règlent à un seul endroit. Un ticket peut être aiguillé vers la </w:t>
+      </w:r>
+      <w:r>
+        <w:rPr>
+          <w:b/>
+          <w:bCs/>
+        </w:rPr>
+        <w:t xml:space="preserve">file</w:t>
+      </w:r>
+      <w:r>
+        <w:t xml:space="preserve"> d'un groupe avant d'être pris par l'un de ses membres.</w:t>
+      </w:r>
+    </w:p>
+    <w:p>
+      <w:pPr>
+        <w:pStyle w:val="Heading2"/>
+        <w:keepNext/>
+      </w:pPr>
+      <w:r>
+        <w:t xml:space="preserve">8.7 Délégation temporaire</w:t>
+      </w:r>
+    </w:p>
+    <w:p>
+      <w:pPr>
+        <w:spacing w:after="120" w:before="0" w:line="276"/>
+      </w:pPr>
+      <w:r>
+        <w:t xml:space="preserve">Pendant un congé, on </w:t>
+      </w:r>
+      <w:r>
+        <w:rPr>
+          <w:b/>
+          <w:bCs/>
+        </w:rPr>
+        <w:t xml:space="preserve">prête</w:t>
+      </w:r>
+      <w:r>
+        <w:t xml:space="preserve"> un rôle plutôt que de le donner. La </w:t>
+      </w:r>
+      <w:r>
+        <w:rPr>
+          <w:b/>
+          <w:bCs/>
+        </w:rPr>
+        <w:t xml:space="preserve">délégation</w:t>
+      </w:r>
+      <w:r>
+        <w:t xml:space="preserve"> a toujours une fin : à l'échéance le droit disparaît seul, sans que personne n'ait à y penser. On ne délègue que ce que l'on détient, jamais le rôle d'administrateur, et les actions faites pendant la délégation sont journalisées au nom de la personne qui agit.</w:t>
       </w:r>
     </w:p>
     <w:p>
@@ -6537,6 +6803,32 @@
             </w:pPr>
             <w:r>
               <w:t xml:space="preserve">Journal d'audit : qui, quoi, quand.</w:t>
+            </w:r>
+          </w:p>
+          <w:p>
+            <w:pPr>
+              <w:pStyle w:val="ListParagraph"/>
+              <w:numPr>
+                <w:ilvl w:val="0"/>
+                <w:numId w:val="2"/>
+              </w:numPr>
+              <w:spacing w:after="60" w:line="276"/>
+            </w:pPr>
+            <w:r>
+              <w:t xml:space="preserve">Groupe : on gère l'équipe, les rôles suivent l'appartenance.</w:t>
+            </w:r>
+          </w:p>
+          <w:p>
+            <w:pPr>
+              <w:pStyle w:val="ListParagraph"/>
+              <w:numPr>
+                <w:ilvl w:val="0"/>
+                <w:numId w:val="2"/>
+              </w:numPr>
+              <w:spacing w:after="60" w:line="276"/>
+            </w:pPr>
+            <w:r>
+              <w:t xml:space="preserve">Délégation : durée bornée, jamais administrateur, traçabilité individuelle.</w:t>
             </w:r>
           </w:p>
         </w:tc>
@@ -18183,6 +18475,26 @@
     <w:p>
       <w:pPr>
         <w:keepNext/>
+        <w:spacing w:after="120" w:before="0" w:line="276"/>
+      </w:pPr>
+      <w:r>
+        <w:rPr>
+          <w:b/>
+          <w:bCs/>
+          <w:color w:val="7A4A00"/>
+        </w:rPr>
+        <w:t xml:space="preserve">Horloge.</w:t>
+      </w:r>
+      <w:r>
+        <w:rPr>
+          <w:color w:val="7A4A00"/>
+        </w:rPr>
+        <w:t xml:space="preserve"> L'agent remonte son inventaire à intervalle régulier : la première remontée est planifiée peu après l'installation. Avancez l'horloge (+15 min ou +1 h) pour la voir arriver, ou forcez-la depuis la fiche de l'agent.</w:t>
+      </w:r>
+    </w:p>
+    <w:p>
+      <w:pPr>
+        <w:keepNext/>
         <w:spacing w:after="40" w:before="0" w:line="276"/>
       </w:pPr>
       <w:r>
@@ -18475,6 +18787,26 @@
     <w:p>
       <w:pPr>
         <w:keepNext/>
+        <w:spacing w:after="120" w:before="0" w:line="276"/>
+      </w:pPr>
+      <w:r>
+        <w:rPr>
+          <w:b/>
+          <w:bCs/>
+          <w:color w:val="7A4A00"/>
+        </w:rPr>
+        <w:t xml:space="preserve">Horloge.</w:t>
+      </w:r>
+      <w:r>
+        <w:rPr>
+          <w:color w:val="7A4A00"/>
+        </w:rPr>
+        <w:t xml:space="preserve"> Sans action de votre part, l'agent remonte tout seul à l'heure prévue. Avancez l'horloge pour constater qu'un inventaire se met à jour avec le temps, au lieu de seulement forcer la remontée.</w:t>
+      </w:r>
+    </w:p>
+    <w:p>
+      <w:pPr>
+        <w:keepNext/>
         <w:spacing w:after="40" w:before="0" w:line="276"/>
       </w:pPr>
       <w:r>
@@ -19325,6 +19657,26 @@
     <w:p>
       <w:pPr>
         <w:keepNext/>
+        <w:spacing w:after="120" w:before="0" w:line="276"/>
+      </w:pPr>
+      <w:r>
+        <w:rPr>
+          <w:b/>
+          <w:bCs/>
+          <w:color w:val="7A4A00"/>
+        </w:rPr>
+        <w:t xml:space="preserve">Horloge.</w:t>
+      </w:r>
+      <w:r>
+        <w:rPr>
+          <w:color w:val="7A4A00"/>
+        </w:rPr>
+        <w:t xml:space="preserve"> Un agent en erreur ne remonte plus : avancez l'horloge pour vérifier si la remontée reprend après votre correction, et pour voir un inventaire devenir obsolète (plusieurs jours sans remontée).</w:t>
+      </w:r>
+    </w:p>
+    <w:p>
+      <w:pPr>
+        <w:keepNext/>
         <w:spacing w:after="40" w:before="0" w:line="276"/>
       </w:pPr>
       <w:r>
@@ -22920,6 +23272,26 @@
     <w:p>
       <w:pPr>
         <w:keepNext/>
+        <w:spacing w:after="120" w:before="0" w:line="276"/>
+      </w:pPr>
+      <w:r>
+        <w:rPr>
+          <w:b/>
+          <w:bCs/>
+          <w:color w:val="7A4A00"/>
+        </w:rPr>
+        <w:t xml:space="preserve">Horloge.</w:t>
+      </w:r>
+      <w:r>
+        <w:rPr>
+          <w:color w:val="7A4A00"/>
+        </w:rPr>
+        <w:t xml:space="preserve"> Le SLA se mesure en temps simulé : 10 minutes se sont déjà écoulées. Avancez l'horloge pour voir un ticket passer de « en cours » à « à risque » puis « dépassé », et constater qu'un ticket « en attente » ne consomme plus de délai.</w:t>
+      </w:r>
+    </w:p>
+    <w:p>
+      <w:pPr>
+        <w:keepNext/>
         <w:spacing w:after="40" w:before="0" w:line="276"/>
       </w:pPr>
       <w:r>
@@ -24786,6 +25158,26 @@
     <w:p>
       <w:pPr>
         <w:keepNext/>
+        <w:spacing w:after="120" w:before="0" w:line="276"/>
+      </w:pPr>
+      <w:r>
+        <w:rPr>
+          <w:b/>
+          <w:bCs/>
+          <w:color w:val="7A4A00"/>
+        </w:rPr>
+        <w:t xml:space="preserve">Horloge.</w:t>
+      </w:r>
+      <w:r>
+        <w:rPr>
+          <w:color w:val="7A4A00"/>
+        </w:rPr>
+        <w:t xml:space="preserve"> Les échéances dépendent de la date simulée : avancez l'horloge de plusieurs jours (+1 jour) pour voir un contrat passer d'« actif » à « proche de l'échéance », puis « expiré ».</w:t>
+      </w:r>
+    </w:p>
+    <w:p>
+      <w:pPr>
+        <w:keepNext/>
         <w:spacing w:after="40" w:before="0" w:line="276"/>
       </w:pPr>
       <w:r>
@@ -28576,6 +28968,2011 @@
       </w:r>
       <w:r>
         <w:t xml:space="preserve"> Résumez en une phrase comment incident, problème et changement s'enchaînent pour NovaTech.</w:t>
+      </w:r>
+    </w:p>
+    <w:p>
+      <w:pPr>
+        <w:pBdr>
+          <w:bottom w:val="single" w:color="A6A6A6" w:sz="4" w:space="1"/>
+        </w:pBdr>
+        <w:spacing w:after="0" w:before="200"/>
+      </w:pPr>
+    </w:p>
+    <w:p>
+      <w:pPr>
+        <w:pBdr>
+          <w:bottom w:val="single" w:color="A6A6A6" w:sz="4" w:space="1"/>
+        </w:pBdr>
+        <w:spacing w:after="0" w:before="200"/>
+      </w:pPr>
+    </w:p>
+    <w:p>
+      <w:pPr>
+        <w:pBdr>
+          <w:bottom w:val="single" w:color="A6A6A6" w:sz="4" w:space="1"/>
+        </w:pBdr>
+        <w:spacing w:after="0" w:before="200"/>
+      </w:pPr>
+    </w:p>
+    <w:tbl>
+      <w:tblPr>
+        <w:tblW w:type="dxa" w:w="9026"/>
+        <w:tblBorders>
+          <w:top w:val="single" w:color="auto" w:sz="4"/>
+          <w:left w:val="single" w:color="auto" w:sz="4"/>
+          <w:bottom w:val="single" w:color="auto" w:sz="4"/>
+          <w:right w:val="single" w:color="auto" w:sz="4"/>
+          <w:insideH w:val="single" w:color="auto" w:sz="4"/>
+          <w:insideV w:val="single" w:color="auto" w:sz="4"/>
+        </w:tblBorders>
+      </w:tblPr>
+      <w:tblGrid>
+        <w:gridCol w:w="2400"/>
+        <w:gridCol w:w="2400"/>
+        <w:gridCol w:w="2226"/>
+        <w:gridCol w:w="2000"/>
+      </w:tblGrid>
+      <w:tr>
+        <w:trPr>
+          <w:cantSplit/>
+        </w:trPr>
+        <w:tc>
+          <w:tcPr>
+            <w:tcW w:type="dxa" w:w="2400"/>
+            <w:tcBorders>
+              <w:top w:val="single" w:color="BFBFBF" w:sz="4"/>
+              <w:left w:val="single" w:color="BFBFBF" w:sz="4"/>
+              <w:bottom w:val="single" w:color="BFBFBF" w:sz="4"/>
+              <w:right w:val="single" w:color="BFBFBF" w:sz="4"/>
+            </w:tcBorders>
+            <w:tcMar>
+              <w:top w:type="dxa" w:w="70"/>
+              <w:left w:type="dxa" w:w="110"/>
+              <w:bottom w:type="dxa" w:w="70"/>
+              <w:right w:type="dxa" w:w="110"/>
+            </w:tcMar>
+            <w:vAlign w:val="top"/>
+          </w:tcPr>
+          <w:p>
+            <w:pPr>
+              <w:spacing w:after="40" w:before="0" w:line="276"/>
+            </w:pPr>
+            <w:r>
+              <w:t xml:space="preserve">Score : ………… / 100</w:t>
+            </w:r>
+          </w:p>
+        </w:tc>
+        <w:tc>
+          <w:tcPr>
+            <w:tcW w:type="dxa" w:w="2400"/>
+            <w:tcBorders>
+              <w:top w:val="single" w:color="BFBFBF" w:sz="4"/>
+              <w:left w:val="single" w:color="BFBFBF" w:sz="4"/>
+              <w:bottom w:val="single" w:color="BFBFBF" w:sz="4"/>
+              <w:right w:val="single" w:color="BFBFBF" w:sz="4"/>
+            </w:tcBorders>
+            <w:tcMar>
+              <w:top w:type="dxa" w:w="70"/>
+              <w:left w:type="dxa" w:w="110"/>
+              <w:bottom w:type="dxa" w:w="70"/>
+              <w:right w:type="dxa" w:w="110"/>
+            </w:tcMar>
+            <w:vAlign w:val="top"/>
+          </w:tcPr>
+          <w:p>
+            <w:pPr>
+              <w:spacing w:after="40" w:before="0" w:line="276"/>
+            </w:pPr>
+            <w:r>
+              <w:t xml:space="preserve">Indices utilisés : …………</w:t>
+            </w:r>
+          </w:p>
+        </w:tc>
+        <w:tc>
+          <w:tcPr>
+            <w:tcW w:type="dxa" w:w="2226"/>
+            <w:tcBorders>
+              <w:top w:val="single" w:color="BFBFBF" w:sz="4"/>
+              <w:left w:val="single" w:color="BFBFBF" w:sz="4"/>
+              <w:bottom w:val="single" w:color="BFBFBF" w:sz="4"/>
+              <w:right w:val="single" w:color="BFBFBF" w:sz="4"/>
+            </w:tcBorders>
+            <w:tcMar>
+              <w:top w:type="dxa" w:w="70"/>
+              <w:left w:type="dxa" w:w="110"/>
+              <w:bottom w:type="dxa" w:w="70"/>
+              <w:right w:type="dxa" w:w="110"/>
+            </w:tcMar>
+            <w:vAlign w:val="top"/>
+          </w:tcPr>
+          <w:p>
+            <w:pPr>
+              <w:spacing w:after="40" w:before="0" w:line="276"/>
+            </w:pPr>
+            <w:r>
+              <w:t xml:space="preserve">Date : ………………</w:t>
+            </w:r>
+          </w:p>
+        </w:tc>
+        <w:tc>
+          <w:tcPr>
+            <w:tcW w:type="dxa" w:w="2000"/>
+            <w:tcBorders>
+              <w:top w:val="single" w:color="BFBFBF" w:sz="4"/>
+              <w:left w:val="single" w:color="BFBFBF" w:sz="4"/>
+              <w:bottom w:val="single" w:color="BFBFBF" w:sz="4"/>
+              <w:right w:val="single" w:color="BFBFBF" w:sz="4"/>
+            </w:tcBorders>
+            <w:tcMar>
+              <w:top w:type="dxa" w:w="70"/>
+              <w:left w:type="dxa" w:w="110"/>
+              <w:bottom w:type="dxa" w:w="70"/>
+              <w:right w:type="dxa" w:w="110"/>
+            </w:tcMar>
+            <w:vAlign w:val="top"/>
+          </w:tcPr>
+          <w:p>
+            <w:pPr>
+              <w:spacing w:after="40" w:before="0" w:line="276"/>
+            </w:pPr>
+            <w:r>
+              <w:t xml:space="preserve">Visa : …………</w:t>
+            </w:r>
+          </w:p>
+        </w:tc>
+      </w:tr>
+    </w:tbl>
+    <w:p>
+      <w:pPr>
+        <w:spacing w:after="160"/>
+      </w:pPr>
+    </w:p>
+    <w:p>
+      <w:pPr>
+        <w:pStyle w:val="Heading2"/>
+        <w:keepNext/>
+      </w:pPr>
+      <w:r>
+        <w:t xml:space="preserve">TP 41 — SLA : le week-end compte-t-il ?</w:t>
+      </w:r>
+    </w:p>
+    <w:p>
+      <w:pPr>
+        <w:keepNext/>
+        <w:spacing w:after="120" w:before="0" w:line="276"/>
+      </w:pPr>
+      <w:r>
+        <w:rPr>
+          <w:i/>
+          <w:iCs/>
+          <w:color w:val="595959"/>
+        </w:rPr>
+        <w:t xml:space="preserve">ITIL · 35 min · difficulté ★★☆☆☆</w:t>
+      </w:r>
+    </w:p>
+    <w:p>
+      <w:pPr>
+        <w:keepNext/>
+        <w:spacing w:after="120" w:before="0" w:line="276"/>
+      </w:pPr>
+      <w:r>
+        <w:rPr>
+          <w:b/>
+          <w:bCs/>
+        </w:rPr>
+        <w:t xml:space="preserve">Contexte.</w:t>
+      </w:r>
+      <w:r>
+        <w:t xml:space="preserve"> Vendredi à 17:00, Alice a signalé que l'imprimante du service comptabilité ne marche plus. Le ticket est qualifié (priorité P3 : 24 h pour résoudre). Nous sommes lundi à 07:00, le service desk n'ouvre qu'à 08:00, et l'outil affiche déjà ce ticket en rouge.</w:t>
+      </w:r>
+    </w:p>
+    <w:p>
+      <w:pPr>
+        <w:keepNext/>
+        <w:spacing w:after="120" w:before="0" w:line="276"/>
+      </w:pPr>
+      <w:r>
+        <w:rPr>
+          <w:b/>
+          <w:bCs/>
+          <w:color w:val="7A4A00"/>
+        </w:rPr>
+        <w:t xml:space="preserve">Horloge.</w:t>
+      </w:r>
+      <w:r>
+        <w:rPr>
+          <w:color w:val="7A4A00"/>
+        </w:rPr>
+        <w:t xml:space="preserve"> Il est lundi 07:00. Le ticket a été ouvert vendredi à 17:00 : tout un week-end s'est écoulé. Observez, dans la liste des tickets, comment le même ticket est jugé « dépassé » ou « en cours » selon le calendrier retenu (page Paramètres de la vue ITSM). Vous pouvez avancer l'horloge, par exemple +1 h, pour voir arriver l'ouverture du service à 08:00.</w:t>
+      </w:r>
+    </w:p>
+    <w:p>
+      <w:pPr>
+        <w:keepNext/>
+        <w:spacing w:after="40" w:before="0" w:line="276"/>
+      </w:pPr>
+      <w:r>
+        <w:rPr>
+          <w:b/>
+          <w:bCs/>
+        </w:rPr>
+        <w:t xml:space="preserve">Objectifs du TP</w:t>
+      </w:r>
+    </w:p>
+    <w:p>
+      <w:pPr>
+        <w:pStyle w:val="ListParagraph"/>
+        <w:numPr>
+          <w:ilvl w:val="0"/>
+          <w:numId w:val="2"/>
+        </w:numPr>
+        <w:spacing w:after="60" w:line="276"/>
+      </w:pPr>
+      <w:r>
+        <w:t xml:space="preserve">Expliquer pourquoi le ticket est affiché « dépassé »</w:t>
+      </w:r>
+    </w:p>
+    <w:p>
+      <w:pPr>
+        <w:pStyle w:val="ListParagraph"/>
+        <w:numPr>
+          <w:ilvl w:val="0"/>
+          <w:numId w:val="2"/>
+        </w:numPr>
+        <w:spacing w:after="60" w:line="276"/>
+      </w:pPr>
+      <w:r>
+        <w:t xml:space="preserve">Le calendrier des SLA correspond à un support aux heures ouvrées</w:t>
+      </w:r>
+    </w:p>
+    <w:p>
+      <w:pPr>
+        <w:pStyle w:val="ListParagraph"/>
+        <w:numPr>
+          <w:ilvl w:val="0"/>
+          <w:numId w:val="2"/>
+        </w:numPr>
+        <w:spacing w:after="60" w:line="276"/>
+      </w:pPr>
+      <w:r>
+        <w:t xml:space="preserve">Le ticket INC-0001 n'est plus « dépassé » : le délai de résolution est de nouveau tenable</w:t>
+      </w:r>
+    </w:p>
+    <w:p>
+      <w:pPr>
+        <w:pStyle w:val="ListParagraph"/>
+        <w:numPr>
+          <w:ilvl w:val="0"/>
+          <w:numId w:val="2"/>
+        </w:numPr>
+        <w:spacing w:after="60" w:line="276"/>
+      </w:pPr>
+      <w:r>
+        <w:t xml:space="preserve">INC-0001 est résolu avec une solution documentée, SLA respecté</w:t>
+      </w:r>
+    </w:p>
+    <w:p>
+      <w:pPr>
+        <w:pStyle w:val="ListParagraph"/>
+        <w:numPr>
+          <w:ilvl w:val="0"/>
+          <w:numId w:val="2"/>
+        </w:numPr>
+        <w:spacing w:after="60" w:line="276"/>
+      </w:pPr>
+      <w:r>
+        <w:t xml:space="preserve">Choisir le calendrier d'un service promis 24 h / 24</w:t>
+      </w:r>
+    </w:p>
+    <w:p>
+      <w:pPr>
+        <w:spacing w:after="120" w:before="80" w:line="276"/>
+      </w:pPr>
+      <w:r>
+        <w:rPr>
+          <w:b/>
+          <w:bCs/>
+        </w:rPr>
+        <w:t xml:space="preserve">Compétence concernée :</w:t>
+      </w:r>
+      <w:r>
+        <w:t xml:space="preserve"> Répondre aux incidents et aux demandes (compétence travaillée) ; Assurer la traçabilité (élément de preuve possible).</w:t>
+      </w:r>
+    </w:p>
+    <w:p>
+      <w:pPr>
+        <w:keepNext/>
+        <w:spacing w:after="120" w:before="80" w:line="276"/>
+      </w:pPr>
+      <w:r>
+        <w:rPr>
+          <w:b/>
+          <w:bCs/>
+        </w:rPr>
+        <w:t xml:space="preserve">Pour aller plus loin.</w:t>
+      </w:r>
+      <w:r>
+        <w:t xml:space="preserve"> Un client exige un support 24 h / 24 pour un service critique. Quel calendrier de SLA choisir, et pourquoi ?</w:t>
+      </w:r>
+    </w:p>
+    <w:p>
+      <w:pPr>
+        <w:pBdr>
+          <w:bottom w:val="single" w:color="A6A6A6" w:sz="4" w:space="1"/>
+        </w:pBdr>
+        <w:spacing w:after="0" w:before="200"/>
+      </w:pPr>
+    </w:p>
+    <w:p>
+      <w:pPr>
+        <w:pBdr>
+          <w:bottom w:val="single" w:color="A6A6A6" w:sz="4" w:space="1"/>
+        </w:pBdr>
+        <w:spacing w:after="0" w:before="200"/>
+      </w:pPr>
+    </w:p>
+    <w:p>
+      <w:pPr>
+        <w:pBdr>
+          <w:bottom w:val="single" w:color="A6A6A6" w:sz="4" w:space="1"/>
+        </w:pBdr>
+        <w:spacing w:after="0" w:before="200"/>
+      </w:pPr>
+    </w:p>
+    <w:tbl>
+      <w:tblPr>
+        <w:tblW w:type="dxa" w:w="9026"/>
+        <w:tblBorders>
+          <w:top w:val="single" w:color="auto" w:sz="4"/>
+          <w:left w:val="single" w:color="auto" w:sz="4"/>
+          <w:bottom w:val="single" w:color="auto" w:sz="4"/>
+          <w:right w:val="single" w:color="auto" w:sz="4"/>
+          <w:insideH w:val="single" w:color="auto" w:sz="4"/>
+          <w:insideV w:val="single" w:color="auto" w:sz="4"/>
+        </w:tblBorders>
+      </w:tblPr>
+      <w:tblGrid>
+        <w:gridCol w:w="2400"/>
+        <w:gridCol w:w="2400"/>
+        <w:gridCol w:w="2226"/>
+        <w:gridCol w:w="2000"/>
+      </w:tblGrid>
+      <w:tr>
+        <w:trPr>
+          <w:cantSplit/>
+        </w:trPr>
+        <w:tc>
+          <w:tcPr>
+            <w:tcW w:type="dxa" w:w="2400"/>
+            <w:tcBorders>
+              <w:top w:val="single" w:color="BFBFBF" w:sz="4"/>
+              <w:left w:val="single" w:color="BFBFBF" w:sz="4"/>
+              <w:bottom w:val="single" w:color="BFBFBF" w:sz="4"/>
+              <w:right w:val="single" w:color="BFBFBF" w:sz="4"/>
+            </w:tcBorders>
+            <w:tcMar>
+              <w:top w:type="dxa" w:w="70"/>
+              <w:left w:type="dxa" w:w="110"/>
+              <w:bottom w:type="dxa" w:w="70"/>
+              <w:right w:type="dxa" w:w="110"/>
+            </w:tcMar>
+            <w:vAlign w:val="top"/>
+          </w:tcPr>
+          <w:p>
+            <w:pPr>
+              <w:spacing w:after="40" w:before="0" w:line="276"/>
+            </w:pPr>
+            <w:r>
+              <w:t xml:space="preserve">Score : ………… / 100</w:t>
+            </w:r>
+          </w:p>
+        </w:tc>
+        <w:tc>
+          <w:tcPr>
+            <w:tcW w:type="dxa" w:w="2400"/>
+            <w:tcBorders>
+              <w:top w:val="single" w:color="BFBFBF" w:sz="4"/>
+              <w:left w:val="single" w:color="BFBFBF" w:sz="4"/>
+              <w:bottom w:val="single" w:color="BFBFBF" w:sz="4"/>
+              <w:right w:val="single" w:color="BFBFBF" w:sz="4"/>
+            </w:tcBorders>
+            <w:tcMar>
+              <w:top w:type="dxa" w:w="70"/>
+              <w:left w:type="dxa" w:w="110"/>
+              <w:bottom w:type="dxa" w:w="70"/>
+              <w:right w:type="dxa" w:w="110"/>
+            </w:tcMar>
+            <w:vAlign w:val="top"/>
+          </w:tcPr>
+          <w:p>
+            <w:pPr>
+              <w:spacing w:after="40" w:before="0" w:line="276"/>
+            </w:pPr>
+            <w:r>
+              <w:t xml:space="preserve">Indices utilisés : …………</w:t>
+            </w:r>
+          </w:p>
+        </w:tc>
+        <w:tc>
+          <w:tcPr>
+            <w:tcW w:type="dxa" w:w="2226"/>
+            <w:tcBorders>
+              <w:top w:val="single" w:color="BFBFBF" w:sz="4"/>
+              <w:left w:val="single" w:color="BFBFBF" w:sz="4"/>
+              <w:bottom w:val="single" w:color="BFBFBF" w:sz="4"/>
+              <w:right w:val="single" w:color="BFBFBF" w:sz="4"/>
+            </w:tcBorders>
+            <w:tcMar>
+              <w:top w:type="dxa" w:w="70"/>
+              <w:left w:type="dxa" w:w="110"/>
+              <w:bottom w:type="dxa" w:w="70"/>
+              <w:right w:type="dxa" w:w="110"/>
+            </w:tcMar>
+            <w:vAlign w:val="top"/>
+          </w:tcPr>
+          <w:p>
+            <w:pPr>
+              <w:spacing w:after="40" w:before="0" w:line="276"/>
+            </w:pPr>
+            <w:r>
+              <w:t xml:space="preserve">Date : ………………</w:t>
+            </w:r>
+          </w:p>
+        </w:tc>
+        <w:tc>
+          <w:tcPr>
+            <w:tcW w:type="dxa" w:w="2000"/>
+            <w:tcBorders>
+              <w:top w:val="single" w:color="BFBFBF" w:sz="4"/>
+              <w:left w:val="single" w:color="BFBFBF" w:sz="4"/>
+              <w:bottom w:val="single" w:color="BFBFBF" w:sz="4"/>
+              <w:right w:val="single" w:color="BFBFBF" w:sz="4"/>
+            </w:tcBorders>
+            <w:tcMar>
+              <w:top w:type="dxa" w:w="70"/>
+              <w:left w:type="dxa" w:w="110"/>
+              <w:bottom w:type="dxa" w:w="70"/>
+              <w:right w:type="dxa" w:w="110"/>
+            </w:tcMar>
+            <w:vAlign w:val="top"/>
+          </w:tcPr>
+          <w:p>
+            <w:pPr>
+              <w:spacing w:after="40" w:before="0" w:line="276"/>
+            </w:pPr>
+            <w:r>
+              <w:t xml:space="preserve">Visa : …………</w:t>
+            </w:r>
+          </w:p>
+        </w:tc>
+      </w:tr>
+    </w:tbl>
+    <w:p>
+      <w:pPr>
+        <w:spacing w:after="160"/>
+      </w:pPr>
+    </w:p>
+    <w:p>
+      <w:pPr>
+        <w:pStyle w:val="Heading2"/>
+        <w:keepNext/>
+      </w:pPr>
+      <w:r>
+        <w:t xml:space="preserve">TP 42 — Une matinée au service desk</w:t>
+      </w:r>
+    </w:p>
+    <w:p>
+      <w:pPr>
+        <w:keepNext/>
+        <w:spacing w:after="120" w:before="0" w:line="276"/>
+      </w:pPr>
+      <w:r>
+        <w:rPr>
+          <w:i/>
+          <w:iCs/>
+          <w:color w:val="595959"/>
+        </w:rPr>
+        <w:t xml:space="preserve">Service Desk · 45 min · difficulté ★★★☆☆</w:t>
+      </w:r>
+    </w:p>
+    <w:p>
+      <w:pPr>
+        <w:keepNext/>
+        <w:spacing w:after="120" w:before="0" w:line="276"/>
+      </w:pPr>
+      <w:r>
+        <w:rPr>
+          <w:b/>
+          <w:bCs/>
+        </w:rPr>
+        <w:t xml:space="preserve">Contexte.</w:t>
+      </w:r>
+      <w:r>
+        <w:t xml:space="preserve"> Il est 8 h 00. Vous tenez seul le service desk de NovaTech. Un premier appel est déjà noté. D'autres arriveront pendant la matinée : un service desk ne reçoit jamais ses tickets tous en même temps, et la priorité de l'un peut bouleverser le traitement de l'autre.</w:t>
+      </w:r>
+    </w:p>
+    <w:p>
+      <w:pPr>
+        <w:keepNext/>
+        <w:spacing w:after="120" w:before="0" w:line="276"/>
+      </w:pPr>
+      <w:r>
+        <w:rPr>
+          <w:b/>
+          <w:bCs/>
+          <w:color w:val="7A4A00"/>
+        </w:rPr>
+        <w:t xml:space="preserve">Horloge.</w:t>
+      </w:r>
+      <w:r>
+        <w:rPr>
+          <w:color w:val="7A4A00"/>
+        </w:rPr>
+        <w:t xml:space="preserve"> Dans ce TP, les appels arrivent au fil du temps simulé. Utilisez +15 min ou +1 h pour faire passer le temps, comme on attend le prochain appel : les nouveaux tickets apparaissent seuls dans la liste, avec un message dans cette section.</w:t>
+      </w:r>
+    </w:p>
+    <w:p>
+      <w:pPr>
+        <w:keepNext/>
+        <w:spacing w:after="40" w:before="0" w:line="276"/>
+      </w:pPr>
+      <w:r>
+        <w:rPr>
+          <w:b/>
+          <w:bCs/>
+        </w:rPr>
+        <w:t xml:space="preserve">Objectifs du TP</w:t>
+      </w:r>
+    </w:p>
+    <w:p>
+      <w:pPr>
+        <w:pStyle w:val="ListParagraph"/>
+        <w:numPr>
+          <w:ilvl w:val="0"/>
+          <w:numId w:val="2"/>
+        </w:numPr>
+        <w:spacing w:after="60" w:line="276"/>
+      </w:pPr>
+      <w:r>
+        <w:t xml:space="preserve">INC-0001 est qualifié avec la priorité que justifie sa description</w:t>
+      </w:r>
+    </w:p>
+    <w:p>
+      <w:pPr>
+        <w:pStyle w:val="ListParagraph"/>
+        <w:numPr>
+          <w:ilvl w:val="0"/>
+          <w:numId w:val="2"/>
+        </w:numPr>
+        <w:spacing w:after="60" w:line="276"/>
+      </w:pPr>
+      <w:r>
+        <w:t xml:space="preserve">Le deuxième appel est arrivé (faites avancer l'horloge)</w:t>
+      </w:r>
+    </w:p>
+    <w:p>
+      <w:pPr>
+        <w:pStyle w:val="ListParagraph"/>
+        <w:numPr>
+          <w:ilvl w:val="0"/>
+          <w:numId w:val="2"/>
+        </w:numPr>
+        <w:spacing w:after="60" w:line="276"/>
+      </w:pPr>
+      <w:r>
+        <w:t xml:space="preserve">Choisir quel ticket traiter en premier</w:t>
+      </w:r>
+    </w:p>
+    <w:p>
+      <w:pPr>
+        <w:pStyle w:val="ListParagraph"/>
+        <w:numPr>
+          <w:ilvl w:val="0"/>
+          <w:numId w:val="2"/>
+        </w:numPr>
+        <w:spacing w:after="60" w:line="276"/>
+      </w:pPr>
+      <w:r>
+        <w:t xml:space="preserve">INC-0002 est qualifié P1 et pris en charge</w:t>
+      </w:r>
+    </w:p>
+    <w:p>
+      <w:pPr>
+        <w:pStyle w:val="ListParagraph"/>
+        <w:numPr>
+          <w:ilvl w:val="0"/>
+          <w:numId w:val="2"/>
+        </w:numPr>
+        <w:spacing w:after="60" w:line="276"/>
+      </w:pPr>
+      <w:r>
+        <w:t xml:space="preserve">Le troisième appel est arrivé (faites encore avancer l'horloge)</w:t>
+      </w:r>
+    </w:p>
+    <w:p>
+      <w:pPr>
+        <w:pStyle w:val="ListParagraph"/>
+        <w:numPr>
+          <w:ilvl w:val="0"/>
+          <w:numId w:val="2"/>
+        </w:numPr>
+        <w:spacing w:after="60" w:line="276"/>
+      </w:pPr>
+      <w:r>
+        <w:t xml:space="preserve">Les trois tickets sont résolus, chacun avec une solution écrite</w:t>
+      </w:r>
+    </w:p>
+    <w:p>
+      <w:pPr>
+        <w:spacing w:after="120" w:before="80" w:line="276"/>
+      </w:pPr>
+      <w:r>
+        <w:rPr>
+          <w:b/>
+          <w:bCs/>
+        </w:rPr>
+        <w:t xml:space="preserve">Compétence concernée :</w:t>
+      </w:r>
+      <w:r>
+        <w:t xml:space="preserve"> Répondre aux incidents et aux demandes (compétence travaillée) ; Assurer la traçabilité (élément de preuve possible).</w:t>
+      </w:r>
+    </w:p>
+    <w:p>
+      <w:pPr>
+        <w:keepNext/>
+        <w:spacing w:after="120" w:before="80" w:line="276"/>
+      </w:pPr>
+      <w:r>
+        <w:rPr>
+          <w:b/>
+          <w:bCs/>
+        </w:rPr>
+        <w:t xml:space="preserve">Pour aller plus loin.</w:t>
+      </w:r>
+      <w:r>
+        <w:t xml:space="preserve"> Deux tickets arrivent à quelques minutes d'intervalle, l'un P4 déjà commencé, l'autre P1. Que faites-vous, et que dites-vous au premier utilisateur ?</w:t>
+      </w:r>
+    </w:p>
+    <w:p>
+      <w:pPr>
+        <w:pBdr>
+          <w:bottom w:val="single" w:color="A6A6A6" w:sz="4" w:space="1"/>
+        </w:pBdr>
+        <w:spacing w:after="0" w:before="200"/>
+      </w:pPr>
+    </w:p>
+    <w:p>
+      <w:pPr>
+        <w:pBdr>
+          <w:bottom w:val="single" w:color="A6A6A6" w:sz="4" w:space="1"/>
+        </w:pBdr>
+        <w:spacing w:after="0" w:before="200"/>
+      </w:pPr>
+    </w:p>
+    <w:p>
+      <w:pPr>
+        <w:pBdr>
+          <w:bottom w:val="single" w:color="A6A6A6" w:sz="4" w:space="1"/>
+        </w:pBdr>
+        <w:spacing w:after="0" w:before="200"/>
+      </w:pPr>
+    </w:p>
+    <w:tbl>
+      <w:tblPr>
+        <w:tblW w:type="dxa" w:w="9026"/>
+        <w:tblBorders>
+          <w:top w:val="single" w:color="auto" w:sz="4"/>
+          <w:left w:val="single" w:color="auto" w:sz="4"/>
+          <w:bottom w:val="single" w:color="auto" w:sz="4"/>
+          <w:right w:val="single" w:color="auto" w:sz="4"/>
+          <w:insideH w:val="single" w:color="auto" w:sz="4"/>
+          <w:insideV w:val="single" w:color="auto" w:sz="4"/>
+        </w:tblBorders>
+      </w:tblPr>
+      <w:tblGrid>
+        <w:gridCol w:w="2400"/>
+        <w:gridCol w:w="2400"/>
+        <w:gridCol w:w="2226"/>
+        <w:gridCol w:w="2000"/>
+      </w:tblGrid>
+      <w:tr>
+        <w:trPr>
+          <w:cantSplit/>
+        </w:trPr>
+        <w:tc>
+          <w:tcPr>
+            <w:tcW w:type="dxa" w:w="2400"/>
+            <w:tcBorders>
+              <w:top w:val="single" w:color="BFBFBF" w:sz="4"/>
+              <w:left w:val="single" w:color="BFBFBF" w:sz="4"/>
+              <w:bottom w:val="single" w:color="BFBFBF" w:sz="4"/>
+              <w:right w:val="single" w:color="BFBFBF" w:sz="4"/>
+            </w:tcBorders>
+            <w:tcMar>
+              <w:top w:type="dxa" w:w="70"/>
+              <w:left w:type="dxa" w:w="110"/>
+              <w:bottom w:type="dxa" w:w="70"/>
+              <w:right w:type="dxa" w:w="110"/>
+            </w:tcMar>
+            <w:vAlign w:val="top"/>
+          </w:tcPr>
+          <w:p>
+            <w:pPr>
+              <w:spacing w:after="40" w:before="0" w:line="276"/>
+            </w:pPr>
+            <w:r>
+              <w:t xml:space="preserve">Score : ………… / 100</w:t>
+            </w:r>
+          </w:p>
+        </w:tc>
+        <w:tc>
+          <w:tcPr>
+            <w:tcW w:type="dxa" w:w="2400"/>
+            <w:tcBorders>
+              <w:top w:val="single" w:color="BFBFBF" w:sz="4"/>
+              <w:left w:val="single" w:color="BFBFBF" w:sz="4"/>
+              <w:bottom w:val="single" w:color="BFBFBF" w:sz="4"/>
+              <w:right w:val="single" w:color="BFBFBF" w:sz="4"/>
+            </w:tcBorders>
+            <w:tcMar>
+              <w:top w:type="dxa" w:w="70"/>
+              <w:left w:type="dxa" w:w="110"/>
+              <w:bottom w:type="dxa" w:w="70"/>
+              <w:right w:type="dxa" w:w="110"/>
+            </w:tcMar>
+            <w:vAlign w:val="top"/>
+          </w:tcPr>
+          <w:p>
+            <w:pPr>
+              <w:spacing w:after="40" w:before="0" w:line="276"/>
+            </w:pPr>
+            <w:r>
+              <w:t xml:space="preserve">Indices utilisés : …………</w:t>
+            </w:r>
+          </w:p>
+        </w:tc>
+        <w:tc>
+          <w:tcPr>
+            <w:tcW w:type="dxa" w:w="2226"/>
+            <w:tcBorders>
+              <w:top w:val="single" w:color="BFBFBF" w:sz="4"/>
+              <w:left w:val="single" w:color="BFBFBF" w:sz="4"/>
+              <w:bottom w:val="single" w:color="BFBFBF" w:sz="4"/>
+              <w:right w:val="single" w:color="BFBFBF" w:sz="4"/>
+            </w:tcBorders>
+            <w:tcMar>
+              <w:top w:type="dxa" w:w="70"/>
+              <w:left w:type="dxa" w:w="110"/>
+              <w:bottom w:type="dxa" w:w="70"/>
+              <w:right w:type="dxa" w:w="110"/>
+            </w:tcMar>
+            <w:vAlign w:val="top"/>
+          </w:tcPr>
+          <w:p>
+            <w:pPr>
+              <w:spacing w:after="40" w:before="0" w:line="276"/>
+            </w:pPr>
+            <w:r>
+              <w:t xml:space="preserve">Date : ………………</w:t>
+            </w:r>
+          </w:p>
+        </w:tc>
+        <w:tc>
+          <w:tcPr>
+            <w:tcW w:type="dxa" w:w="2000"/>
+            <w:tcBorders>
+              <w:top w:val="single" w:color="BFBFBF" w:sz="4"/>
+              <w:left w:val="single" w:color="BFBFBF" w:sz="4"/>
+              <w:bottom w:val="single" w:color="BFBFBF" w:sz="4"/>
+              <w:right w:val="single" w:color="BFBFBF" w:sz="4"/>
+            </w:tcBorders>
+            <w:tcMar>
+              <w:top w:type="dxa" w:w="70"/>
+              <w:left w:type="dxa" w:w="110"/>
+              <w:bottom w:type="dxa" w:w="70"/>
+              <w:right w:type="dxa" w:w="110"/>
+            </w:tcMar>
+            <w:vAlign w:val="top"/>
+          </w:tcPr>
+          <w:p>
+            <w:pPr>
+              <w:spacing w:after="40" w:before="0" w:line="276"/>
+            </w:pPr>
+            <w:r>
+              <w:t xml:space="preserve">Visa : …………</w:t>
+            </w:r>
+          </w:p>
+        </w:tc>
+      </w:tr>
+    </w:tbl>
+    <w:p>
+      <w:pPr>
+        <w:spacing w:after="160"/>
+      </w:pPr>
+    </w:p>
+    <w:p>
+      <w:pPr>
+        <w:pStyle w:val="Heading2"/>
+        <w:keepNext/>
+      </w:pPr>
+      <w:r>
+        <w:t xml:space="preserve">TP 43 — Quand l'hyperviseur s'arrête</w:t>
+      </w:r>
+    </w:p>
+    <w:p>
+      <w:pPr>
+        <w:keepNext/>
+        <w:spacing w:after="120" w:before="0" w:line="276"/>
+      </w:pPr>
+      <w:r>
+        <w:rPr>
+          <w:i/>
+          <w:iCs/>
+          <w:color w:val="595959"/>
+        </w:rPr>
+        <w:t xml:space="preserve">Incidents techniques · 45 min · difficulté ★★★☆☆</w:t>
+      </w:r>
+    </w:p>
+    <w:p>
+      <w:pPr>
+        <w:keepNext/>
+        <w:spacing w:after="120" w:before="0" w:line="276"/>
+      </w:pPr>
+      <w:r>
+        <w:rPr>
+          <w:b/>
+          <w:bCs/>
+        </w:rPr>
+        <w:t xml:space="preserve">Contexte.</w:t>
+      </w:r>
+      <w:r>
+        <w:t xml:space="preserve"> NovaTech héberge deux serveurs virtuels, VM-APP01 (application RH) et VM-APP02 (intranet), sur un seul hyperviseur, HV-01. Ce matin tout va bien. Plus tard, des utilisateurs vont signaler que « deux applications ne marchent plus ». À vous de trouver ce qu'elles ont en commun.</w:t>
+      </w:r>
+    </w:p>
+    <w:p>
+      <w:pPr>
+        <w:keepNext/>
+        <w:spacing w:after="120" w:before="0" w:line="276"/>
+      </w:pPr>
+      <w:r>
+        <w:rPr>
+          <w:b/>
+          <w:bCs/>
+          <w:color w:val="7A4A00"/>
+        </w:rPr>
+        <w:t xml:space="preserve">Horloge.</w:t>
+      </w:r>
+      <w:r>
+        <w:rPr>
+          <w:color w:val="7A4A00"/>
+        </w:rPr>
+        <w:t xml:space="preserve"> Tout fonctionne au début de ce TP : la panne survient dans le temps simulé, puis les appels arrivent. Avancez l'horloge (+15 min) jusqu'à ce que les tickets apparaissent.</w:t>
+      </w:r>
+    </w:p>
+    <w:p>
+      <w:pPr>
+        <w:keepNext/>
+        <w:spacing w:after="40" w:before="0" w:line="276"/>
+      </w:pPr>
+      <w:r>
+        <w:rPr>
+          <w:b/>
+          <w:bCs/>
+        </w:rPr>
+        <w:t xml:space="preserve">Objectifs du TP</w:t>
+      </w:r>
+    </w:p>
+    <w:p>
+      <w:pPr>
+        <w:pStyle w:val="ListParagraph"/>
+        <w:numPr>
+          <w:ilvl w:val="0"/>
+          <w:numId w:val="2"/>
+        </w:numPr>
+        <w:spacing w:after="60" w:line="276"/>
+      </w:pPr>
+      <w:r>
+        <w:t xml:space="preserve">Le premier appel est arrivé (faites avancer l'horloge)</w:t>
+      </w:r>
+    </w:p>
+    <w:p>
+      <w:pPr>
+        <w:pStyle w:val="ListParagraph"/>
+        <w:numPr>
+          <w:ilvl w:val="0"/>
+          <w:numId w:val="2"/>
+        </w:numPr>
+        <w:spacing w:after="60" w:line="276"/>
+      </w:pPr>
+      <w:r>
+        <w:t xml:space="preserve">Le second appel est arrivé</w:t>
+      </w:r>
+    </w:p>
+    <w:p>
+      <w:pPr>
+        <w:pStyle w:val="ListParagraph"/>
+        <w:numPr>
+          <w:ilvl w:val="0"/>
+          <w:numId w:val="2"/>
+        </w:numPr>
+        <w:spacing w:after="60" w:line="276"/>
+      </w:pPr>
+      <w:r>
+        <w:t xml:space="preserve">Formuler l'hypothèse du point commun</w:t>
+      </w:r>
+    </w:p>
+    <w:p>
+      <w:pPr>
+        <w:pStyle w:val="ListParagraph"/>
+        <w:numPr>
+          <w:ilvl w:val="0"/>
+          <w:numId w:val="2"/>
+        </w:numPr>
+        <w:spacing w:after="60" w:line="276"/>
+      </w:pPr>
+      <w:r>
+        <w:t xml:space="preserve">Les deux tickets sont rattachés à l'actif HV-01</w:t>
+      </w:r>
+    </w:p>
+    <w:p>
+      <w:pPr>
+        <w:pStyle w:val="ListParagraph"/>
+        <w:numPr>
+          <w:ilvl w:val="0"/>
+          <w:numId w:val="2"/>
+        </w:numPr>
+        <w:spacing w:after="60" w:line="276"/>
+      </w:pPr>
+      <w:r>
+        <w:t xml:space="preserve">HV-01 et ses deux machines virtuelles sont de nouveau en ligne</w:t>
+      </w:r>
+    </w:p>
+    <w:p>
+      <w:pPr>
+        <w:pStyle w:val="ListParagraph"/>
+        <w:numPr>
+          <w:ilvl w:val="0"/>
+          <w:numId w:val="2"/>
+        </w:numPr>
+        <w:spacing w:after="60" w:line="276"/>
+      </w:pPr>
+      <w:r>
+        <w:t xml:space="preserve">Les deux tickets sont résolus avec une solution documentée</w:t>
+      </w:r>
+    </w:p>
+    <w:p>
+      <w:pPr>
+        <w:pStyle w:val="ListParagraph"/>
+        <w:numPr>
+          <w:ilvl w:val="0"/>
+          <w:numId w:val="2"/>
+        </w:numPr>
+        <w:spacing w:after="60" w:line="276"/>
+      </w:pPr>
+      <w:r>
+        <w:t xml:space="preserve">Tirer la leçon sur la dépendance</w:t>
+      </w:r>
+    </w:p>
+    <w:p>
+      <w:pPr>
+        <w:spacing w:after="120" w:before="80" w:line="276"/>
+      </w:pPr>
+      <w:r>
+        <w:rPr>
+          <w:b/>
+          <w:bCs/>
+        </w:rPr>
+        <w:t xml:space="preserve">Compétence concernée :</w:t>
+      </w:r>
+      <w:r>
+        <w:t xml:space="preserve"> Exploiter et dépanner (compétence travaillée) ; Répondre aux incidents et aux demandes (compétence travaillée) ; Gérer le patrimoine informatique (compétence travaillée).</w:t>
+      </w:r>
+    </w:p>
+    <w:p>
+      <w:pPr>
+        <w:keepNext/>
+        <w:spacing w:after="120" w:before="80" w:line="276"/>
+      </w:pPr>
+      <w:r>
+        <w:rPr>
+          <w:b/>
+          <w:bCs/>
+        </w:rPr>
+        <w:t xml:space="preserve">Pour aller plus loin.</w:t>
+      </w:r>
+      <w:r>
+        <w:t xml:space="preserve"> Comment la CMDB aurait-elle permis de trouver la cause plus vite ?</w:t>
+      </w:r>
+    </w:p>
+    <w:p>
+      <w:pPr>
+        <w:pBdr>
+          <w:bottom w:val="single" w:color="A6A6A6" w:sz="4" w:space="1"/>
+        </w:pBdr>
+        <w:spacing w:after="0" w:before="200"/>
+      </w:pPr>
+    </w:p>
+    <w:p>
+      <w:pPr>
+        <w:pBdr>
+          <w:bottom w:val="single" w:color="A6A6A6" w:sz="4" w:space="1"/>
+        </w:pBdr>
+        <w:spacing w:after="0" w:before="200"/>
+      </w:pPr>
+    </w:p>
+    <w:p>
+      <w:pPr>
+        <w:pBdr>
+          <w:bottom w:val="single" w:color="A6A6A6" w:sz="4" w:space="1"/>
+        </w:pBdr>
+        <w:spacing w:after="0" w:before="200"/>
+      </w:pPr>
+    </w:p>
+    <w:tbl>
+      <w:tblPr>
+        <w:tblW w:type="dxa" w:w="9026"/>
+        <w:tblBorders>
+          <w:top w:val="single" w:color="auto" w:sz="4"/>
+          <w:left w:val="single" w:color="auto" w:sz="4"/>
+          <w:bottom w:val="single" w:color="auto" w:sz="4"/>
+          <w:right w:val="single" w:color="auto" w:sz="4"/>
+          <w:insideH w:val="single" w:color="auto" w:sz="4"/>
+          <w:insideV w:val="single" w:color="auto" w:sz="4"/>
+        </w:tblBorders>
+      </w:tblPr>
+      <w:tblGrid>
+        <w:gridCol w:w="2400"/>
+        <w:gridCol w:w="2400"/>
+        <w:gridCol w:w="2226"/>
+        <w:gridCol w:w="2000"/>
+      </w:tblGrid>
+      <w:tr>
+        <w:trPr>
+          <w:cantSplit/>
+        </w:trPr>
+        <w:tc>
+          <w:tcPr>
+            <w:tcW w:type="dxa" w:w="2400"/>
+            <w:tcBorders>
+              <w:top w:val="single" w:color="BFBFBF" w:sz="4"/>
+              <w:left w:val="single" w:color="BFBFBF" w:sz="4"/>
+              <w:bottom w:val="single" w:color="BFBFBF" w:sz="4"/>
+              <w:right w:val="single" w:color="BFBFBF" w:sz="4"/>
+            </w:tcBorders>
+            <w:tcMar>
+              <w:top w:type="dxa" w:w="70"/>
+              <w:left w:type="dxa" w:w="110"/>
+              <w:bottom w:type="dxa" w:w="70"/>
+              <w:right w:type="dxa" w:w="110"/>
+            </w:tcMar>
+            <w:vAlign w:val="top"/>
+          </w:tcPr>
+          <w:p>
+            <w:pPr>
+              <w:spacing w:after="40" w:before="0" w:line="276"/>
+            </w:pPr>
+            <w:r>
+              <w:t xml:space="preserve">Score : ………… / 100</w:t>
+            </w:r>
+          </w:p>
+        </w:tc>
+        <w:tc>
+          <w:tcPr>
+            <w:tcW w:type="dxa" w:w="2400"/>
+            <w:tcBorders>
+              <w:top w:val="single" w:color="BFBFBF" w:sz="4"/>
+              <w:left w:val="single" w:color="BFBFBF" w:sz="4"/>
+              <w:bottom w:val="single" w:color="BFBFBF" w:sz="4"/>
+              <w:right w:val="single" w:color="BFBFBF" w:sz="4"/>
+            </w:tcBorders>
+            <w:tcMar>
+              <w:top w:type="dxa" w:w="70"/>
+              <w:left w:type="dxa" w:w="110"/>
+              <w:bottom w:type="dxa" w:w="70"/>
+              <w:right w:type="dxa" w:w="110"/>
+            </w:tcMar>
+            <w:vAlign w:val="top"/>
+          </w:tcPr>
+          <w:p>
+            <w:pPr>
+              <w:spacing w:after="40" w:before="0" w:line="276"/>
+            </w:pPr>
+            <w:r>
+              <w:t xml:space="preserve">Indices utilisés : …………</w:t>
+            </w:r>
+          </w:p>
+        </w:tc>
+        <w:tc>
+          <w:tcPr>
+            <w:tcW w:type="dxa" w:w="2226"/>
+            <w:tcBorders>
+              <w:top w:val="single" w:color="BFBFBF" w:sz="4"/>
+              <w:left w:val="single" w:color="BFBFBF" w:sz="4"/>
+              <w:bottom w:val="single" w:color="BFBFBF" w:sz="4"/>
+              <w:right w:val="single" w:color="BFBFBF" w:sz="4"/>
+            </w:tcBorders>
+            <w:tcMar>
+              <w:top w:type="dxa" w:w="70"/>
+              <w:left w:type="dxa" w:w="110"/>
+              <w:bottom w:type="dxa" w:w="70"/>
+              <w:right w:type="dxa" w:w="110"/>
+            </w:tcMar>
+            <w:vAlign w:val="top"/>
+          </w:tcPr>
+          <w:p>
+            <w:pPr>
+              <w:spacing w:after="40" w:before="0" w:line="276"/>
+            </w:pPr>
+            <w:r>
+              <w:t xml:space="preserve">Date : ………………</w:t>
+            </w:r>
+          </w:p>
+        </w:tc>
+        <w:tc>
+          <w:tcPr>
+            <w:tcW w:type="dxa" w:w="2000"/>
+            <w:tcBorders>
+              <w:top w:val="single" w:color="BFBFBF" w:sz="4"/>
+              <w:left w:val="single" w:color="BFBFBF" w:sz="4"/>
+              <w:bottom w:val="single" w:color="BFBFBF" w:sz="4"/>
+              <w:right w:val="single" w:color="BFBFBF" w:sz="4"/>
+            </w:tcBorders>
+            <w:tcMar>
+              <w:top w:type="dxa" w:w="70"/>
+              <w:left w:type="dxa" w:w="110"/>
+              <w:bottom w:type="dxa" w:w="70"/>
+              <w:right w:type="dxa" w:w="110"/>
+            </w:tcMar>
+            <w:vAlign w:val="top"/>
+          </w:tcPr>
+          <w:p>
+            <w:pPr>
+              <w:spacing w:after="40" w:before="0" w:line="276"/>
+            </w:pPr>
+            <w:r>
+              <w:t xml:space="preserve">Visa : …………</w:t>
+            </w:r>
+          </w:p>
+        </w:tc>
+      </w:tr>
+    </w:tbl>
+    <w:p>
+      <w:pPr>
+        <w:spacing w:after="160"/>
+      </w:pPr>
+    </w:p>
+    <w:p>
+      <w:pPr>
+        <w:pStyle w:val="Heading2"/>
+        <w:keepNext/>
+      </w:pPr>
+      <w:r>
+        <w:t xml:space="preserve">TP 44 — Maintenance planifiée d'un hyperviseur</w:t>
+      </w:r>
+    </w:p>
+    <w:p>
+      <w:pPr>
+        <w:keepNext/>
+        <w:spacing w:after="120" w:before="0" w:line="276"/>
+      </w:pPr>
+      <w:r>
+        <w:rPr>
+          <w:i/>
+          <w:iCs/>
+          <w:color w:val="595959"/>
+        </w:rPr>
+        <w:t xml:space="preserve">ITIL · 50 min · difficulté ★★★☆☆</w:t>
+      </w:r>
+    </w:p>
+    <w:p>
+      <w:pPr>
+        <w:keepNext/>
+        <w:spacing w:after="120" w:before="0" w:line="276"/>
+      </w:pPr>
+      <w:r>
+        <w:rPr>
+          <w:b/>
+          <w:bCs/>
+        </w:rPr>
+        <w:t xml:space="preserve">Contexte.</w:t>
+      </w:r>
+      <w:r>
+        <w:t xml:space="preserve"> HV-01 doit recevoir une mise à jour du micrologiciel : il faudra l'éteindre. Il héberge VM-APP01 (application RH) et VM-APP02 (intranet), utilisées toute la journée. Un second hyperviseur, HV-02, a la capacité de les accueillir. Il est lundi 8 h : l'intervention doit se faire le soir, sans coupure pour les utilisateurs.</w:t>
+      </w:r>
+    </w:p>
+    <w:p>
+      <w:pPr>
+        <w:keepNext/>
+        <w:spacing w:after="120" w:before="0" w:line="276"/>
+      </w:pPr>
+      <w:r>
+        <w:rPr>
+          <w:b/>
+          <w:bCs/>
+          <w:color w:val="7A4A00"/>
+        </w:rPr>
+        <w:t xml:space="preserve">Horloge.</w:t>
+      </w:r>
+      <w:r>
+        <w:rPr>
+          <w:color w:val="7A4A00"/>
+        </w:rPr>
+        <w:t xml:space="preserve"> La maintenance doit avoir lieu hors des heures ouvrées : il faut donc planifier une heure du soir, puis faire avancer l'horloge jusqu'à ce moment (+1 h, plusieurs fois, ou +1 jour) avant d'intervenir. Une intervention se prévoit dans le temps ; on ne la fait pas « tout de suite ».</w:t>
+      </w:r>
+    </w:p>
+    <w:p>
+      <w:pPr>
+        <w:keepNext/>
+        <w:spacing w:after="40" w:before="0" w:line="276"/>
+      </w:pPr>
+      <w:r>
+        <w:rPr>
+          <w:b/>
+          <w:bCs/>
+        </w:rPr>
+        <w:t xml:space="preserve">Objectifs du TP</w:t>
+      </w:r>
+    </w:p>
+    <w:p>
+      <w:pPr>
+        <w:pStyle w:val="ListParagraph"/>
+        <w:numPr>
+          <w:ilvl w:val="0"/>
+          <w:numId w:val="2"/>
+        </w:numPr>
+        <w:spacing w:after="60" w:line="276"/>
+      </w:pPr>
+      <w:r>
+        <w:t xml:space="preserve">Prévoir l'effet d'un arrêt de HV-01 sur ses machines virtuelles</w:t>
+      </w:r>
+    </w:p>
+    <w:p>
+      <w:pPr>
+        <w:pStyle w:val="ListParagraph"/>
+        <w:numPr>
+          <w:ilvl w:val="0"/>
+          <w:numId w:val="2"/>
+        </w:numPr>
+        <w:spacing w:after="60" w:line="276"/>
+      </w:pPr>
+      <w:r>
+        <w:t xml:space="preserve">Un changement normal lié à HV-01 est approuvé et planifié hors heures ouvrées</w:t>
+      </w:r>
+    </w:p>
+    <w:p>
+      <w:pPr>
+        <w:pStyle w:val="ListParagraph"/>
+        <w:numPr>
+          <w:ilvl w:val="0"/>
+          <w:numId w:val="2"/>
+        </w:numPr>
+        <w:spacing w:after="60" w:line="276"/>
+      </w:pPr>
+      <w:r>
+        <w:t xml:space="preserve">VM-APP01 et VM-APP02 sont hébergées sur HV-02</w:t>
+      </w:r>
+    </w:p>
+    <w:p>
+      <w:pPr>
+        <w:pStyle w:val="ListParagraph"/>
+        <w:numPr>
+          <w:ilvl w:val="0"/>
+          <w:numId w:val="2"/>
+        </w:numPr>
+        <w:spacing w:after="60" w:line="276"/>
+      </w:pPr>
+      <w:r>
+        <w:t xml:space="preserve">À l'heure prévue, HV-01 est éteint et les machines virtuelles sont restées en ligne</w:t>
+      </w:r>
+    </w:p>
+    <w:p>
+      <w:pPr>
+        <w:pStyle w:val="ListParagraph"/>
+        <w:numPr>
+          <w:ilvl w:val="0"/>
+          <w:numId w:val="2"/>
+        </w:numPr>
+        <w:spacing w:after="60" w:line="276"/>
+      </w:pPr>
+      <w:r>
+        <w:t xml:space="preserve">Le changement est vérifié, avec son résultat consigné</w:t>
+      </w:r>
+    </w:p>
+    <w:p>
+      <w:pPr>
+        <w:spacing w:after="120" w:before="80" w:line="276"/>
+      </w:pPr>
+      <w:r>
+        <w:rPr>
+          <w:b/>
+          <w:bCs/>
+        </w:rPr>
+        <w:t xml:space="preserve">Compétence concernée :</w:t>
+      </w:r>
+      <w:r>
+        <w:t xml:space="preserve"> Travailler en mode projet (compétence travaillée) ; Exploiter et dépanner (compétence travaillée) ; Assurer la traçabilité (élément de preuve possible).</w:t>
+      </w:r>
+    </w:p>
+    <w:p>
+      <w:pPr>
+        <w:keepNext/>
+        <w:spacing w:after="120" w:before="80" w:line="276"/>
+      </w:pPr>
+      <w:r>
+        <w:rPr>
+          <w:b/>
+          <w:bCs/>
+        </w:rPr>
+        <w:t xml:space="preserve">Pour aller plus loin.</w:t>
+      </w:r>
+      <w:r>
+        <w:t xml:space="preserve"> Pourquoi planifier la maintenance hors des heures ouvrées, et que doit contenir le plan de retour arrière ?</w:t>
+      </w:r>
+    </w:p>
+    <w:p>
+      <w:pPr>
+        <w:pBdr>
+          <w:bottom w:val="single" w:color="A6A6A6" w:sz="4" w:space="1"/>
+        </w:pBdr>
+        <w:spacing w:after="0" w:before="200"/>
+      </w:pPr>
+    </w:p>
+    <w:p>
+      <w:pPr>
+        <w:pBdr>
+          <w:bottom w:val="single" w:color="A6A6A6" w:sz="4" w:space="1"/>
+        </w:pBdr>
+        <w:spacing w:after="0" w:before="200"/>
+      </w:pPr>
+    </w:p>
+    <w:p>
+      <w:pPr>
+        <w:pBdr>
+          <w:bottom w:val="single" w:color="A6A6A6" w:sz="4" w:space="1"/>
+        </w:pBdr>
+        <w:spacing w:after="0" w:before="200"/>
+      </w:pPr>
+    </w:p>
+    <w:tbl>
+      <w:tblPr>
+        <w:tblW w:type="dxa" w:w="9026"/>
+        <w:tblBorders>
+          <w:top w:val="single" w:color="auto" w:sz="4"/>
+          <w:left w:val="single" w:color="auto" w:sz="4"/>
+          <w:bottom w:val="single" w:color="auto" w:sz="4"/>
+          <w:right w:val="single" w:color="auto" w:sz="4"/>
+          <w:insideH w:val="single" w:color="auto" w:sz="4"/>
+          <w:insideV w:val="single" w:color="auto" w:sz="4"/>
+        </w:tblBorders>
+      </w:tblPr>
+      <w:tblGrid>
+        <w:gridCol w:w="2400"/>
+        <w:gridCol w:w="2400"/>
+        <w:gridCol w:w="2226"/>
+        <w:gridCol w:w="2000"/>
+      </w:tblGrid>
+      <w:tr>
+        <w:trPr>
+          <w:cantSplit/>
+        </w:trPr>
+        <w:tc>
+          <w:tcPr>
+            <w:tcW w:type="dxa" w:w="2400"/>
+            <w:tcBorders>
+              <w:top w:val="single" w:color="BFBFBF" w:sz="4"/>
+              <w:left w:val="single" w:color="BFBFBF" w:sz="4"/>
+              <w:bottom w:val="single" w:color="BFBFBF" w:sz="4"/>
+              <w:right w:val="single" w:color="BFBFBF" w:sz="4"/>
+            </w:tcBorders>
+            <w:tcMar>
+              <w:top w:type="dxa" w:w="70"/>
+              <w:left w:type="dxa" w:w="110"/>
+              <w:bottom w:type="dxa" w:w="70"/>
+              <w:right w:type="dxa" w:w="110"/>
+            </w:tcMar>
+            <w:vAlign w:val="top"/>
+          </w:tcPr>
+          <w:p>
+            <w:pPr>
+              <w:spacing w:after="40" w:before="0" w:line="276"/>
+            </w:pPr>
+            <w:r>
+              <w:t xml:space="preserve">Score : ………… / 100</w:t>
+            </w:r>
+          </w:p>
+        </w:tc>
+        <w:tc>
+          <w:tcPr>
+            <w:tcW w:type="dxa" w:w="2400"/>
+            <w:tcBorders>
+              <w:top w:val="single" w:color="BFBFBF" w:sz="4"/>
+              <w:left w:val="single" w:color="BFBFBF" w:sz="4"/>
+              <w:bottom w:val="single" w:color="BFBFBF" w:sz="4"/>
+              <w:right w:val="single" w:color="BFBFBF" w:sz="4"/>
+            </w:tcBorders>
+            <w:tcMar>
+              <w:top w:type="dxa" w:w="70"/>
+              <w:left w:type="dxa" w:w="110"/>
+              <w:bottom w:type="dxa" w:w="70"/>
+              <w:right w:type="dxa" w:w="110"/>
+            </w:tcMar>
+            <w:vAlign w:val="top"/>
+          </w:tcPr>
+          <w:p>
+            <w:pPr>
+              <w:spacing w:after="40" w:before="0" w:line="276"/>
+            </w:pPr>
+            <w:r>
+              <w:t xml:space="preserve">Indices utilisés : …………</w:t>
+            </w:r>
+          </w:p>
+        </w:tc>
+        <w:tc>
+          <w:tcPr>
+            <w:tcW w:type="dxa" w:w="2226"/>
+            <w:tcBorders>
+              <w:top w:val="single" w:color="BFBFBF" w:sz="4"/>
+              <w:left w:val="single" w:color="BFBFBF" w:sz="4"/>
+              <w:bottom w:val="single" w:color="BFBFBF" w:sz="4"/>
+              <w:right w:val="single" w:color="BFBFBF" w:sz="4"/>
+            </w:tcBorders>
+            <w:tcMar>
+              <w:top w:type="dxa" w:w="70"/>
+              <w:left w:type="dxa" w:w="110"/>
+              <w:bottom w:type="dxa" w:w="70"/>
+              <w:right w:type="dxa" w:w="110"/>
+            </w:tcMar>
+            <w:vAlign w:val="top"/>
+          </w:tcPr>
+          <w:p>
+            <w:pPr>
+              <w:spacing w:after="40" w:before="0" w:line="276"/>
+            </w:pPr>
+            <w:r>
+              <w:t xml:space="preserve">Date : ………………</w:t>
+            </w:r>
+          </w:p>
+        </w:tc>
+        <w:tc>
+          <w:tcPr>
+            <w:tcW w:type="dxa" w:w="2000"/>
+            <w:tcBorders>
+              <w:top w:val="single" w:color="BFBFBF" w:sz="4"/>
+              <w:left w:val="single" w:color="BFBFBF" w:sz="4"/>
+              <w:bottom w:val="single" w:color="BFBFBF" w:sz="4"/>
+              <w:right w:val="single" w:color="BFBFBF" w:sz="4"/>
+            </w:tcBorders>
+            <w:tcMar>
+              <w:top w:type="dxa" w:w="70"/>
+              <w:left w:type="dxa" w:w="110"/>
+              <w:bottom w:type="dxa" w:w="70"/>
+              <w:right w:type="dxa" w:w="110"/>
+            </w:tcMar>
+            <w:vAlign w:val="top"/>
+          </w:tcPr>
+          <w:p>
+            <w:pPr>
+              <w:spacing w:after="40" w:before="0" w:line="276"/>
+            </w:pPr>
+            <w:r>
+              <w:t xml:space="preserve">Visa : …………</w:t>
+            </w:r>
+          </w:p>
+        </w:tc>
+      </w:tr>
+    </w:tbl>
+    <w:p>
+      <w:pPr>
+        <w:spacing w:after="160"/>
+      </w:pPr>
+    </w:p>
+    <w:p>
+      <w:pPr>
+        <w:pStyle w:val="Heading2"/>
+        <w:keepNext/>
+      </w:pPr>
+      <w:r>
+        <w:t xml:space="preserve">TP 45 — Équipes et groupes de techniciens</w:t>
+      </w:r>
+    </w:p>
+    <w:p>
+      <w:pPr>
+        <w:keepNext/>
+        <w:spacing w:after="120" w:before="0" w:line="276"/>
+      </w:pPr>
+      <w:r>
+        <w:rPr>
+          <w:i/>
+          <w:iCs/>
+          <w:color w:val="595959"/>
+        </w:rPr>
+        <w:t xml:space="preserve">Administration · 35 min · difficulté ★★☆☆☆</w:t>
+      </w:r>
+    </w:p>
+    <w:p>
+      <w:pPr>
+        <w:keepNext/>
+        <w:spacing w:after="120" w:before="0" w:line="276"/>
+      </w:pPr>
+      <w:r>
+        <w:rPr>
+          <w:b/>
+          <w:bCs/>
+        </w:rPr>
+        <w:t xml:space="preserve">Contexte.</w:t>
+      </w:r>
+      <w:r>
+        <w:t xml:space="preserve"> Le service desk de niveau 1 s'agrandit : Karim Benali et Nadia Roux le rejoignent. Ils ont déjà un compte, avec le seul rôle « Utilisateur ». Plutôt que d'ajouter des rôles compte par compte, NovaTech veut un groupe « Support N1 » qui porte le rôle Technicien. Deux tickets attendent déjà d'être affectés à l'équipe.</w:t>
+      </w:r>
+    </w:p>
+    <w:p>
+      <w:pPr>
+        <w:keepNext/>
+        <w:spacing w:after="40" w:before="0" w:line="276"/>
+      </w:pPr>
+      <w:r>
+        <w:rPr>
+          <w:b/>
+          <w:bCs/>
+        </w:rPr>
+        <w:t xml:space="preserve">Objectifs du TP</w:t>
+      </w:r>
+    </w:p>
+    <w:p>
+      <w:pPr>
+        <w:pStyle w:val="ListParagraph"/>
+        <w:numPr>
+          <w:ilvl w:val="0"/>
+          <w:numId w:val="2"/>
+        </w:numPr>
+        <w:spacing w:after="60" w:line="276"/>
+      </w:pPr>
+      <w:r>
+        <w:t xml:space="preserve">Justifier l'usage d'un groupe</w:t>
+      </w:r>
+    </w:p>
+    <w:p>
+      <w:pPr>
+        <w:pStyle w:val="ListParagraph"/>
+        <w:numPr>
+          <w:ilvl w:val="0"/>
+          <w:numId w:val="2"/>
+        </w:numPr>
+        <w:spacing w:after="60" w:line="276"/>
+      </w:pPr>
+      <w:r>
+        <w:t xml:space="preserve">Le groupe « Support N1 » existe, avec le rôle Technicien et Karim parmi ses membres</w:t>
+      </w:r>
+    </w:p>
+    <w:p>
+      <w:pPr>
+        <w:pStyle w:val="ListParagraph"/>
+        <w:numPr>
+          <w:ilvl w:val="0"/>
+          <w:numId w:val="2"/>
+        </w:numPr>
+        <w:spacing w:after="60" w:line="276"/>
+      </w:pPr>
+      <w:r>
+        <w:t xml:space="preserve">Karim est technicien par son groupe, sans que son compte personnel ait changé</w:t>
+      </w:r>
+    </w:p>
+    <w:p>
+      <w:pPr>
+        <w:pStyle w:val="ListParagraph"/>
+        <w:numPr>
+          <w:ilvl w:val="0"/>
+          <w:numId w:val="2"/>
+        </w:numPr>
+        <w:spacing w:after="60" w:line="276"/>
+      </w:pPr>
+      <w:r>
+        <w:t xml:space="preserve">INC-0001 est aiguillé vers la file « Support N1 »</w:t>
+      </w:r>
+    </w:p>
+    <w:p>
+      <w:pPr>
+        <w:pStyle w:val="ListParagraph"/>
+        <w:numPr>
+          <w:ilvl w:val="0"/>
+          <w:numId w:val="2"/>
+        </w:numPr>
+        <w:spacing w:after="60" w:line="276"/>
+      </w:pPr>
+      <w:r>
+        <w:t xml:space="preserve">INC-0001 est attribué à Karim</w:t>
+      </w:r>
+    </w:p>
+    <w:p>
+      <w:pPr>
+        <w:pStyle w:val="ListParagraph"/>
+        <w:numPr>
+          <w:ilvl w:val="0"/>
+          <w:numId w:val="2"/>
+        </w:numPr>
+        <w:spacing w:after="60" w:line="276"/>
+      </w:pPr>
+      <w:r>
+        <w:t xml:space="preserve">Nadia n'est plus technicien (elle a quitté le groupe)</w:t>
+      </w:r>
+    </w:p>
+    <w:p>
+      <w:pPr>
+        <w:spacing w:after="120" w:before="80" w:line="276"/>
+      </w:pPr>
+      <w:r>
+        <w:rPr>
+          <w:b/>
+          <w:bCs/>
+        </w:rPr>
+        <w:t xml:space="preserve">Compétence concernée :</w:t>
+      </w:r>
+      <w:r>
+        <w:t xml:space="preserve"> Gérer les habilitations (compétence travaillée) ; Participer à la vie de la cybersécurité (compétence travaillée).</w:t>
+      </w:r>
+    </w:p>
+    <w:p>
+      <w:pPr>
+        <w:keepNext/>
+        <w:spacing w:after="120" w:before="80" w:line="276"/>
+      </w:pPr>
+      <w:r>
+        <w:rPr>
+          <w:b/>
+          <w:bCs/>
+        </w:rPr>
+        <w:t xml:space="preserve">Pour aller plus loin.</w:t>
+      </w:r>
+      <w:r>
+        <w:t xml:space="preserve"> Un technicien change de service. Que fait-on dans le groupe, et pourquoi est-ce plus sûr que de modifier son compte ?</w:t>
+      </w:r>
+    </w:p>
+    <w:p>
+      <w:pPr>
+        <w:pBdr>
+          <w:bottom w:val="single" w:color="A6A6A6" w:sz="4" w:space="1"/>
+        </w:pBdr>
+        <w:spacing w:after="0" w:before="200"/>
+      </w:pPr>
+    </w:p>
+    <w:p>
+      <w:pPr>
+        <w:pBdr>
+          <w:bottom w:val="single" w:color="A6A6A6" w:sz="4" w:space="1"/>
+        </w:pBdr>
+        <w:spacing w:after="0" w:before="200"/>
+      </w:pPr>
+    </w:p>
+    <w:p>
+      <w:pPr>
+        <w:pBdr>
+          <w:bottom w:val="single" w:color="A6A6A6" w:sz="4" w:space="1"/>
+        </w:pBdr>
+        <w:spacing w:after="0" w:before="200"/>
+      </w:pPr>
+    </w:p>
+    <w:tbl>
+      <w:tblPr>
+        <w:tblW w:type="dxa" w:w="9026"/>
+        <w:tblBorders>
+          <w:top w:val="single" w:color="auto" w:sz="4"/>
+          <w:left w:val="single" w:color="auto" w:sz="4"/>
+          <w:bottom w:val="single" w:color="auto" w:sz="4"/>
+          <w:right w:val="single" w:color="auto" w:sz="4"/>
+          <w:insideH w:val="single" w:color="auto" w:sz="4"/>
+          <w:insideV w:val="single" w:color="auto" w:sz="4"/>
+        </w:tblBorders>
+      </w:tblPr>
+      <w:tblGrid>
+        <w:gridCol w:w="2400"/>
+        <w:gridCol w:w="2400"/>
+        <w:gridCol w:w="2226"/>
+        <w:gridCol w:w="2000"/>
+      </w:tblGrid>
+      <w:tr>
+        <w:trPr>
+          <w:cantSplit/>
+        </w:trPr>
+        <w:tc>
+          <w:tcPr>
+            <w:tcW w:type="dxa" w:w="2400"/>
+            <w:tcBorders>
+              <w:top w:val="single" w:color="BFBFBF" w:sz="4"/>
+              <w:left w:val="single" w:color="BFBFBF" w:sz="4"/>
+              <w:bottom w:val="single" w:color="BFBFBF" w:sz="4"/>
+              <w:right w:val="single" w:color="BFBFBF" w:sz="4"/>
+            </w:tcBorders>
+            <w:tcMar>
+              <w:top w:type="dxa" w:w="70"/>
+              <w:left w:type="dxa" w:w="110"/>
+              <w:bottom w:type="dxa" w:w="70"/>
+              <w:right w:type="dxa" w:w="110"/>
+            </w:tcMar>
+            <w:vAlign w:val="top"/>
+          </w:tcPr>
+          <w:p>
+            <w:pPr>
+              <w:spacing w:after="40" w:before="0" w:line="276"/>
+            </w:pPr>
+            <w:r>
+              <w:t xml:space="preserve">Score : ………… / 100</w:t>
+            </w:r>
+          </w:p>
+        </w:tc>
+        <w:tc>
+          <w:tcPr>
+            <w:tcW w:type="dxa" w:w="2400"/>
+            <w:tcBorders>
+              <w:top w:val="single" w:color="BFBFBF" w:sz="4"/>
+              <w:left w:val="single" w:color="BFBFBF" w:sz="4"/>
+              <w:bottom w:val="single" w:color="BFBFBF" w:sz="4"/>
+              <w:right w:val="single" w:color="BFBFBF" w:sz="4"/>
+            </w:tcBorders>
+            <w:tcMar>
+              <w:top w:type="dxa" w:w="70"/>
+              <w:left w:type="dxa" w:w="110"/>
+              <w:bottom w:type="dxa" w:w="70"/>
+              <w:right w:type="dxa" w:w="110"/>
+            </w:tcMar>
+            <w:vAlign w:val="top"/>
+          </w:tcPr>
+          <w:p>
+            <w:pPr>
+              <w:spacing w:after="40" w:before="0" w:line="276"/>
+            </w:pPr>
+            <w:r>
+              <w:t xml:space="preserve">Indices utilisés : …………</w:t>
+            </w:r>
+          </w:p>
+        </w:tc>
+        <w:tc>
+          <w:tcPr>
+            <w:tcW w:type="dxa" w:w="2226"/>
+            <w:tcBorders>
+              <w:top w:val="single" w:color="BFBFBF" w:sz="4"/>
+              <w:left w:val="single" w:color="BFBFBF" w:sz="4"/>
+              <w:bottom w:val="single" w:color="BFBFBF" w:sz="4"/>
+              <w:right w:val="single" w:color="BFBFBF" w:sz="4"/>
+            </w:tcBorders>
+            <w:tcMar>
+              <w:top w:type="dxa" w:w="70"/>
+              <w:left w:type="dxa" w:w="110"/>
+              <w:bottom w:type="dxa" w:w="70"/>
+              <w:right w:type="dxa" w:w="110"/>
+            </w:tcMar>
+            <w:vAlign w:val="top"/>
+          </w:tcPr>
+          <w:p>
+            <w:pPr>
+              <w:spacing w:after="40" w:before="0" w:line="276"/>
+            </w:pPr>
+            <w:r>
+              <w:t xml:space="preserve">Date : ………………</w:t>
+            </w:r>
+          </w:p>
+        </w:tc>
+        <w:tc>
+          <w:tcPr>
+            <w:tcW w:type="dxa" w:w="2000"/>
+            <w:tcBorders>
+              <w:top w:val="single" w:color="BFBFBF" w:sz="4"/>
+              <w:left w:val="single" w:color="BFBFBF" w:sz="4"/>
+              <w:bottom w:val="single" w:color="BFBFBF" w:sz="4"/>
+              <w:right w:val="single" w:color="BFBFBF" w:sz="4"/>
+            </w:tcBorders>
+            <w:tcMar>
+              <w:top w:type="dxa" w:w="70"/>
+              <w:left w:type="dxa" w:w="110"/>
+              <w:bottom w:type="dxa" w:w="70"/>
+              <w:right w:type="dxa" w:w="110"/>
+            </w:tcMar>
+            <w:vAlign w:val="top"/>
+          </w:tcPr>
+          <w:p>
+            <w:pPr>
+              <w:spacing w:after="40" w:before="0" w:line="276"/>
+            </w:pPr>
+            <w:r>
+              <w:t xml:space="preserve">Visa : …………</w:t>
+            </w:r>
+          </w:p>
+        </w:tc>
+      </w:tr>
+    </w:tbl>
+    <w:p>
+      <w:pPr>
+        <w:spacing w:after="160"/>
+      </w:pPr>
+    </w:p>
+    <w:p>
+      <w:pPr>
+        <w:pStyle w:val="Heading2"/>
+        <w:keepNext/>
+      </w:pPr>
+      <w:r>
+        <w:t xml:space="preserve">TP 46 — Délégation de droits pendant un congé</w:t>
+      </w:r>
+    </w:p>
+    <w:p>
+      <w:pPr>
+        <w:keepNext/>
+        <w:spacing w:after="120" w:before="0" w:line="276"/>
+      </w:pPr>
+      <w:r>
+        <w:rPr>
+          <w:i/>
+          <w:iCs/>
+          <w:color w:val="595959"/>
+        </w:rPr>
+        <w:t xml:space="preserve">Administration · 40 min · difficulté ★★★☆☆</w:t>
+      </w:r>
+    </w:p>
+    <w:p>
+      <w:pPr>
+        <w:keepNext/>
+        <w:spacing w:after="120" w:before="0" w:line="276"/>
+      </w:pPr>
+      <w:r>
+        <w:rPr>
+          <w:b/>
+          <w:bCs/>
+        </w:rPr>
+        <w:t xml:space="preserve">Contexte.</w:t>
+      </w:r>
+      <w:r>
+        <w:t xml:space="preserve"> David Petit, seul technicien de l'entreprise, part en congé. Karim Benali, qui n'a que le rôle « Utilisateur », doit le remplacer pendant 24 heures. Donner définitivement le rôle Technicien à Karim serait excessif : on utilise une </w:t>
+      </w:r>
+      <w:r>
+        <w:rPr>
+          <w:b/>
+          <w:bCs/>
+        </w:rPr>
+        <w:t xml:space="preserve">délégation</w:t>
+      </w:r>
+      <w:r>
+        <w:t xml:space="preserve">, qui prête le rôle pour une durée limitée.</w:t>
+      </w:r>
+    </w:p>
+    <w:p>
+      <w:pPr>
+        <w:keepNext/>
+        <w:spacing w:after="120" w:before="0" w:line="276"/>
+      </w:pPr>
+      <w:r>
+        <w:rPr>
+          <w:b/>
+          <w:bCs/>
+          <w:color w:val="7A4A00"/>
+        </w:rPr>
+        <w:t xml:space="preserve">Horloge.</w:t>
+      </w:r>
+      <w:r>
+        <w:rPr>
+          <w:color w:val="7A4A00"/>
+        </w:rPr>
+        <w:t xml:space="preserve"> Une délégation a une date de fin. Pour la voir expirer, faites avancer l'horloge (+1 jour) après avoir testé les droits de Karim : le droit disparaît sans que personne ne le retire.</w:t>
+      </w:r>
+    </w:p>
+    <w:p>
+      <w:pPr>
+        <w:keepNext/>
+        <w:spacing w:after="40" w:before="0" w:line="276"/>
+      </w:pPr>
+      <w:r>
+        <w:rPr>
+          <w:b/>
+          <w:bCs/>
+        </w:rPr>
+        <w:t xml:space="preserve">Objectifs du TP</w:t>
+      </w:r>
+    </w:p>
+    <w:p>
+      <w:pPr>
+        <w:pStyle w:val="ListParagraph"/>
+        <w:numPr>
+          <w:ilvl w:val="0"/>
+          <w:numId w:val="2"/>
+        </w:numPr>
+        <w:spacing w:after="60" w:line="276"/>
+      </w:pPr>
+      <w:r>
+        <w:t xml:space="preserve">Justifier une délégation plutôt qu'un rôle permanent</w:t>
+      </w:r>
+    </w:p>
+    <w:p>
+      <w:pPr>
+        <w:pStyle w:val="ListParagraph"/>
+        <w:numPr>
+          <w:ilvl w:val="0"/>
+          <w:numId w:val="2"/>
+        </w:numPr>
+        <w:spacing w:after="60" w:line="276"/>
+      </w:pPr>
+      <w:r>
+        <w:t xml:space="preserve">David a délégué le rôle Technicien à Karim</w:t>
+      </w:r>
+    </w:p>
+    <w:p>
+      <w:pPr>
+        <w:pStyle w:val="ListParagraph"/>
+        <w:numPr>
+          <w:ilvl w:val="0"/>
+          <w:numId w:val="2"/>
+        </w:numPr>
+        <w:spacing w:after="60" w:line="276"/>
+      </w:pPr>
+      <w:r>
+        <w:t xml:space="preserve">Vous agissez en tant que Karim Benali</w:t>
+      </w:r>
+    </w:p>
+    <w:p>
+      <w:pPr>
+        <w:pStyle w:val="ListParagraph"/>
+        <w:numPr>
+          <w:ilvl w:val="0"/>
+          <w:numId w:val="2"/>
+        </w:numPr>
+        <w:spacing w:after="60" w:line="276"/>
+      </w:pPr>
+      <w:r>
+        <w:t xml:space="preserve">Karim a pris en charge INC-0001, et c'est lui qui l'a fait</w:t>
+      </w:r>
+    </w:p>
+    <w:p>
+      <w:pPr>
+        <w:pStyle w:val="ListParagraph"/>
+        <w:numPr>
+          <w:ilvl w:val="0"/>
+          <w:numId w:val="2"/>
+        </w:numPr>
+        <w:spacing w:after="60" w:line="276"/>
+      </w:pPr>
+      <w:r>
+        <w:t xml:space="preserve">La délégation est arrivée à échéance (faites avancer l'horloge)</w:t>
+      </w:r>
+    </w:p>
+    <w:p>
+      <w:pPr>
+        <w:pStyle w:val="ListParagraph"/>
+        <w:numPr>
+          <w:ilvl w:val="0"/>
+          <w:numId w:val="2"/>
+        </w:numPr>
+        <w:spacing w:after="60" w:line="276"/>
+      </w:pPr>
+      <w:r>
+        <w:t xml:space="preserve">Prévoir ce qui arrive à Karim après l'échéance</w:t>
+      </w:r>
+    </w:p>
+    <w:p>
+      <w:pPr>
+        <w:spacing w:after="120" w:before="80" w:line="276"/>
+      </w:pPr>
+      <w:r>
+        <w:rPr>
+          <w:b/>
+          <w:bCs/>
+        </w:rPr>
+        <w:t xml:space="preserve">Compétence concernée :</w:t>
+      </w:r>
+      <w:r>
+        <w:t xml:space="preserve"> Gérer les habilitations (compétence travaillée) ; Assurer la traçabilité (élément de preuve possible) ; Participer à la vie de la cybersécurité (compétence travaillée).</w:t>
+      </w:r>
+    </w:p>
+    <w:p>
+      <w:pPr>
+        <w:keepNext/>
+        <w:spacing w:after="120" w:before="80" w:line="276"/>
+      </w:pPr>
+      <w:r>
+        <w:rPr>
+          <w:b/>
+          <w:bCs/>
+        </w:rPr>
+        <w:t xml:space="preserve">Pour aller plus loin.</w:t>
+      </w:r>
+      <w:r>
+        <w:t xml:space="preserve"> Pourquoi le rôle d'administrateur ne doit-il pas se déléguer comme les autres ?</w:t>
       </w:r>
     </w:p>
     <w:p>
@@ -30283,7 +32680,7 @@
                 <w:b/>
                 <w:bCs/>
               </w:rPr>
-              <w:t xml:space="preserve">Catégorie</w:t>
+              <w:t xml:space="preserve">Calendrier de SLA</w:t>
             </w:r>
           </w:p>
         </w:tc>
@@ -30309,7 +32706,7 @@
               <w:spacing w:after="40" w:before="0" w:line="276"/>
             </w:pPr>
             <w:r>
-              <w:t xml:space="preserve">Classement d'un ticket pour l'orienter vers la bonne équipe.</w:t>
+              <w:t xml:space="preserve">Heures qui comptent dans le décompte : continu (24 h / 24) ou ouvrées (lundi–vendredi, 8 h–18 h).</w:t>
             </w:r>
           </w:p>
         </w:tc>
@@ -30345,7 +32742,7 @@
                 <w:b/>
                 <w:bCs/>
               </w:rPr>
-              <w:t xml:space="preserve">Changement (change)</w:t>
+              <w:t xml:space="preserve">Catégorie</w:t>
             </w:r>
           </w:p>
         </w:tc>
@@ -30371,7 +32768,7 @@
               <w:spacing w:after="40" w:before="0" w:line="276"/>
             </w:pPr>
             <w:r>
-              <w:t xml:space="preserve">Modification de la production, soumise à évaluation et approbation.</w:t>
+              <w:t xml:space="preserve">Classement d'un ticket pour l'orienter vers la bonne équipe.</w:t>
             </w:r>
           </w:p>
         </w:tc>
@@ -30407,7 +32804,7 @@
                 <w:b/>
                 <w:bCs/>
               </w:rPr>
-              <w:t xml:space="preserve">CI (élément de configuration)</w:t>
+              <w:t xml:space="preserve">Changement (change)</w:t>
             </w:r>
           </w:p>
         </w:tc>
@@ -30433,7 +32830,7 @@
               <w:spacing w:after="40" w:before="0" w:line="276"/>
             </w:pPr>
             <w:r>
-              <w:t xml:space="preserve">Élément dont on suit les dépendances dans la CMDB.</w:t>
+              <w:t xml:space="preserve">Modification de la production, soumise à évaluation et approbation.</w:t>
             </w:r>
           </w:p>
         </w:tc>
@@ -30469,7 +32866,7 @@
                 <w:b/>
                 <w:bCs/>
               </w:rPr>
-              <w:t xml:space="preserve">Clôture</w:t>
+              <w:t xml:space="preserve">CI (élément de configuration)</w:t>
             </w:r>
           </w:p>
         </w:tc>
@@ -30495,7 +32892,7 @@
               <w:spacing w:after="40" w:before="0" w:line="276"/>
             </w:pPr>
             <w:r>
-              <w:t xml:space="preserve">Statut final d'un ticket après confirmation de l'utilisateur.</w:t>
+              <w:t xml:space="preserve">Élément dont on suit les dépendances dans la CMDB.</w:t>
             </w:r>
           </w:p>
         </w:tc>
@@ -30531,7 +32928,7 @@
                 <w:b/>
                 <w:bCs/>
               </w:rPr>
-              <w:t xml:space="preserve">CMDB</w:t>
+              <w:t xml:space="preserve">Clôture</w:t>
             </w:r>
           </w:p>
         </w:tc>
@@ -30557,7 +32954,7 @@
               <w:spacing w:after="40" w:before="0" w:line="276"/>
             </w:pPr>
             <w:r>
-              <w:t xml:space="preserve">Base des éléments de configuration et de leurs relations.</w:t>
+              <w:t xml:space="preserve">Statut final d'un ticket après confirmation de l'utilisateur.</w:t>
             </w:r>
           </w:p>
         </w:tc>
@@ -30593,7 +32990,7 @@
                 <w:b/>
                 <w:bCs/>
               </w:rPr>
-              <w:t xml:space="preserve">Conformité</w:t>
+              <w:t xml:space="preserve">CMDB</w:t>
             </w:r>
           </w:p>
         </w:tc>
@@ -30619,7 +33016,7 @@
               <w:spacing w:after="40" w:before="0" w:line="276"/>
             </w:pPr>
             <w:r>
-              <w:t xml:space="preserve">Comparaison entre droits achetés et installations constatées.</w:t>
+              <w:t xml:space="preserve">Base des éléments de configuration et de leurs relations.</w:t>
             </w:r>
           </w:p>
         </w:tc>
@@ -30655,7 +33052,7 @@
                 <w:b/>
                 <w:bCs/>
               </w:rPr>
-              <w:t xml:space="preserve">Contournement (workaround)</w:t>
+              <w:t xml:space="preserve">Conformité</w:t>
             </w:r>
           </w:p>
         </w:tc>
@@ -30681,7 +33078,7 @@
               <w:spacing w:after="40" w:before="0" w:line="276"/>
             </w:pPr>
             <w:r>
-              <w:t xml:space="preserve">Moyen de rétablir le service en attendant la correction définitive.</w:t>
+              <w:t xml:space="preserve">Comparaison entre droits achetés et installations constatées.</w:t>
             </w:r>
           </w:p>
         </w:tc>
@@ -30717,7 +33114,7 @@
                 <w:b/>
                 <w:bCs/>
               </w:rPr>
-              <w:t xml:space="preserve">Découverte réseau</w:t>
+              <w:t xml:space="preserve">Contournement (workaround)</w:t>
             </w:r>
           </w:p>
         </w:tc>
@@ -30743,7 +33140,7 @@
               <w:spacing w:after="40" w:before="0" w:line="276"/>
             </w:pPr>
             <w:r>
-              <w:t xml:space="preserve">Scan d'une plage d'adresses pour détecter les équipements qui répondent.</w:t>
+              <w:t xml:space="preserve">Moyen de rétablir le service en attendant la correction définitive.</w:t>
             </w:r>
           </w:p>
         </w:tc>
@@ -30779,7 +33176,7 @@
                 <w:b/>
                 <w:bCs/>
               </w:rPr>
-              <w:t xml:space="preserve">Demande de service</w:t>
+              <w:t xml:space="preserve">Découverte réseau</w:t>
             </w:r>
           </w:p>
         </w:tc>
@@ -30805,7 +33202,7 @@
               <w:spacing w:after="40" w:before="0" w:line="276"/>
             </w:pPr>
             <w:r>
-              <w:t xml:space="preserve">Demande de quelque chose de prévu au catalogue.</w:t>
+              <w:t xml:space="preserve">Scan d'une plage d'adresses pour détecter les équipements qui répondent.</w:t>
             </w:r>
           </w:p>
         </w:tc>
@@ -30841,6 +33238,130 @@
                 <w:b/>
                 <w:bCs/>
               </w:rPr>
+              <w:t xml:space="preserve">Délégation</w:t>
+            </w:r>
+          </w:p>
+        </w:tc>
+        <w:tc>
+          <w:tcPr>
+            <w:tcW w:type="dxa" w:w="6226"/>
+            <w:tcBorders>
+              <w:top w:val="single" w:color="BFBFBF" w:sz="4"/>
+              <w:left w:val="single" w:color="BFBFBF" w:sz="4"/>
+              <w:bottom w:val="single" w:color="BFBFBF" w:sz="4"/>
+              <w:right w:val="single" w:color="BFBFBF" w:sz="4"/>
+            </w:tcBorders>
+            <w:tcMar>
+              <w:top w:type="dxa" w:w="70"/>
+              <w:left w:type="dxa" w:w="110"/>
+              <w:bottom w:type="dxa" w:w="70"/>
+              <w:right w:type="dxa" w:w="110"/>
+            </w:tcMar>
+            <w:vAlign w:val="top"/>
+          </w:tcPr>
+          <w:p>
+            <w:pPr>
+              <w:spacing w:after="40" w:before="0" w:line="276"/>
+            </w:pPr>
+            <w:r>
+              <w:t xml:space="preserve">Prêt temporaire d'un rôle à une personne, avec une date de fin.</w:t>
+            </w:r>
+          </w:p>
+        </w:tc>
+      </w:tr>
+      <w:tr>
+        <w:trPr>
+          <w:cantSplit/>
+        </w:trPr>
+        <w:tc>
+          <w:tcPr>
+            <w:tcW w:type="dxa" w:w="2800"/>
+            <w:tcBorders>
+              <w:top w:val="single" w:color="BFBFBF" w:sz="4"/>
+              <w:left w:val="single" w:color="BFBFBF" w:sz="4"/>
+              <w:bottom w:val="single" w:color="BFBFBF" w:sz="4"/>
+              <w:right w:val="single" w:color="BFBFBF" w:sz="4"/>
+            </w:tcBorders>
+            <w:shd w:fill="F2F2F2" w:color="auto" w:val="clear"/>
+            <w:tcMar>
+              <w:top w:type="dxa" w:w="70"/>
+              <w:left w:type="dxa" w:w="110"/>
+              <w:bottom w:type="dxa" w:w="70"/>
+              <w:right w:type="dxa" w:w="110"/>
+            </w:tcMar>
+            <w:vAlign w:val="top"/>
+          </w:tcPr>
+          <w:p>
+            <w:pPr>
+              <w:spacing w:after="40" w:before="0" w:line="276"/>
+            </w:pPr>
+            <w:r>
+              <w:rPr>
+                <w:b/>
+                <w:bCs/>
+              </w:rPr>
+              <w:t xml:space="preserve">Demande de service</w:t>
+            </w:r>
+          </w:p>
+        </w:tc>
+        <w:tc>
+          <w:tcPr>
+            <w:tcW w:type="dxa" w:w="6226"/>
+            <w:tcBorders>
+              <w:top w:val="single" w:color="BFBFBF" w:sz="4"/>
+              <w:left w:val="single" w:color="BFBFBF" w:sz="4"/>
+              <w:bottom w:val="single" w:color="BFBFBF" w:sz="4"/>
+              <w:right w:val="single" w:color="BFBFBF" w:sz="4"/>
+            </w:tcBorders>
+            <w:tcMar>
+              <w:top w:type="dxa" w:w="70"/>
+              <w:left w:type="dxa" w:w="110"/>
+              <w:bottom w:type="dxa" w:w="70"/>
+              <w:right w:type="dxa" w:w="110"/>
+            </w:tcMar>
+            <w:vAlign w:val="top"/>
+          </w:tcPr>
+          <w:p>
+            <w:pPr>
+              <w:spacing w:after="40" w:before="0" w:line="276"/>
+            </w:pPr>
+            <w:r>
+              <w:t xml:space="preserve">Demande de quelque chose de prévu au catalogue.</w:t>
+            </w:r>
+          </w:p>
+        </w:tc>
+      </w:tr>
+      <w:tr>
+        <w:trPr>
+          <w:cantSplit/>
+        </w:trPr>
+        <w:tc>
+          <w:tcPr>
+            <w:tcW w:type="dxa" w:w="2800"/>
+            <w:tcBorders>
+              <w:top w:val="single" w:color="BFBFBF" w:sz="4"/>
+              <w:left w:val="single" w:color="BFBFBF" w:sz="4"/>
+              <w:bottom w:val="single" w:color="BFBFBF" w:sz="4"/>
+              <w:right w:val="single" w:color="BFBFBF" w:sz="4"/>
+            </w:tcBorders>
+            <w:shd w:fill="F2F2F2" w:color="auto" w:val="clear"/>
+            <w:tcMar>
+              <w:top w:type="dxa" w:w="70"/>
+              <w:left w:type="dxa" w:w="110"/>
+              <w:bottom w:type="dxa" w:w="70"/>
+              <w:right w:type="dxa" w:w="110"/>
+            </w:tcMar>
+            <w:vAlign w:val="top"/>
+          </w:tcPr>
+          <w:p>
+            <w:pPr>
+              <w:spacing w:after="40" w:before="0" w:line="276"/>
+            </w:pPr>
+            <w:r>
+              <w:rPr>
+                <w:b/>
+                <w:bCs/>
+              </w:rPr>
               <w:t xml:space="preserve">Erreur connue</w:t>
             </w:r>
           </w:p>
@@ -30868,6 +33389,130 @@
             </w:pPr>
             <w:r>
               <w:t xml:space="preserve">Problème dont la cause et le contournement sont documentés.</w:t>
+            </w:r>
+          </w:p>
+        </w:tc>
+      </w:tr>
+      <w:tr>
+        <w:trPr>
+          <w:cantSplit/>
+        </w:trPr>
+        <w:tc>
+          <w:tcPr>
+            <w:tcW w:type="dxa" w:w="2800"/>
+            <w:tcBorders>
+              <w:top w:val="single" w:color="BFBFBF" w:sz="4"/>
+              <w:left w:val="single" w:color="BFBFBF" w:sz="4"/>
+              <w:bottom w:val="single" w:color="BFBFBF" w:sz="4"/>
+              <w:right w:val="single" w:color="BFBFBF" w:sz="4"/>
+            </w:tcBorders>
+            <w:shd w:fill="F2F2F2" w:color="auto" w:val="clear"/>
+            <w:tcMar>
+              <w:top w:type="dxa" w:w="70"/>
+              <w:left w:type="dxa" w:w="110"/>
+              <w:bottom w:type="dxa" w:w="70"/>
+              <w:right w:type="dxa" w:w="110"/>
+            </w:tcMar>
+            <w:vAlign w:val="top"/>
+          </w:tcPr>
+          <w:p>
+            <w:pPr>
+              <w:spacing w:after="40" w:before="0" w:line="276"/>
+            </w:pPr>
+            <w:r>
+              <w:rPr>
+                <w:b/>
+                <w:bCs/>
+              </w:rPr>
+              <w:t xml:space="preserve">Groupe</w:t>
+            </w:r>
+          </w:p>
+        </w:tc>
+        <w:tc>
+          <w:tcPr>
+            <w:tcW w:type="dxa" w:w="6226"/>
+            <w:tcBorders>
+              <w:top w:val="single" w:color="BFBFBF" w:sz="4"/>
+              <w:left w:val="single" w:color="BFBFBF" w:sz="4"/>
+              <w:bottom w:val="single" w:color="BFBFBF" w:sz="4"/>
+              <w:right w:val="single" w:color="BFBFBF" w:sz="4"/>
+            </w:tcBorders>
+            <w:tcMar>
+              <w:top w:type="dxa" w:w="70"/>
+              <w:left w:type="dxa" w:w="110"/>
+              <w:bottom w:type="dxa" w:w="70"/>
+              <w:right w:type="dxa" w:w="110"/>
+            </w:tcMar>
+            <w:vAlign w:val="top"/>
+          </w:tcPr>
+          <w:p>
+            <w:pPr>
+              <w:spacing w:after="40" w:before="0" w:line="276"/>
+            </w:pPr>
+            <w:r>
+              <w:t xml:space="preserve">Ensemble de personnes qui reçoivent ensemble les rôles du groupe.</w:t>
+            </w:r>
+          </w:p>
+        </w:tc>
+      </w:tr>
+      <w:tr>
+        <w:trPr>
+          <w:cantSplit/>
+        </w:trPr>
+        <w:tc>
+          <w:tcPr>
+            <w:tcW w:type="dxa" w:w="2800"/>
+            <w:tcBorders>
+              <w:top w:val="single" w:color="BFBFBF" w:sz="4"/>
+              <w:left w:val="single" w:color="BFBFBF" w:sz="4"/>
+              <w:bottom w:val="single" w:color="BFBFBF" w:sz="4"/>
+              <w:right w:val="single" w:color="BFBFBF" w:sz="4"/>
+            </w:tcBorders>
+            <w:shd w:fill="F2F2F2" w:color="auto" w:val="clear"/>
+            <w:tcMar>
+              <w:top w:type="dxa" w:w="70"/>
+              <w:left w:type="dxa" w:w="110"/>
+              <w:bottom w:type="dxa" w:w="70"/>
+              <w:right w:type="dxa" w:w="110"/>
+            </w:tcMar>
+            <w:vAlign w:val="top"/>
+          </w:tcPr>
+          <w:p>
+            <w:pPr>
+              <w:spacing w:after="40" w:before="0" w:line="276"/>
+            </w:pPr>
+            <w:r>
+              <w:rPr>
+                <w:b/>
+                <w:bCs/>
+              </w:rPr>
+              <w:t xml:space="preserve">Hyperviseur</w:t>
+            </w:r>
+          </w:p>
+        </w:tc>
+        <w:tc>
+          <w:tcPr>
+            <w:tcW w:type="dxa" w:w="6226"/>
+            <w:tcBorders>
+              <w:top w:val="single" w:color="BFBFBF" w:sz="4"/>
+              <w:left w:val="single" w:color="BFBFBF" w:sz="4"/>
+              <w:bottom w:val="single" w:color="BFBFBF" w:sz="4"/>
+              <w:right w:val="single" w:color="BFBFBF" w:sz="4"/>
+            </w:tcBorders>
+            <w:tcMar>
+              <w:top w:type="dxa" w:w="70"/>
+              <w:left w:type="dxa" w:w="110"/>
+              <w:bottom w:type="dxa" w:w="70"/>
+              <w:right w:type="dxa" w:w="110"/>
+            </w:tcMar>
+            <w:vAlign w:val="top"/>
+          </w:tcPr>
+          <w:p>
+            <w:pPr>
+              <w:spacing w:after="40" w:before="0" w:line="276"/>
+            </w:pPr>
+            <w:r>
+              <w:t xml:space="preserve">Logiciel ou serveur qui héberge des machines virtuelles.</w:t>
             </w:r>
           </w:p>
         </w:tc>

</xml_diff>

<commit_message>
Escalade des tickets : fonctionnelle (N1-N3, groupe) et hiérarchique (responsable alerté)
- Commande itsm.escalate (motif obligatoire, historique, SLA repris si en attente), droit ticket.escalate
- Conseils selon l'état du SLA ; section Escalade sur la fiche ticket, niveau dans la liste
- TP 47 (escalade fonctionnelle) et 48 (escalade hiérarchique), contrôles « clock », « escalated », « ticketLevel »
- Aide, guide formateur, architecture et livrets mis à jour ; 336 tests

Co-Authored-By: Claude Sonnet 5.5 <noreply@anthropic.com>
Claude-Session: https://claude.ai/code/session_01MVQzj29gmjNLwcKSj2knfw
</commit_message>
<xml_diff>
--- a/docs/livrets/InfraLab-Livret-eleve.docx
+++ b/docs/livrets/InfraLab-Livret-eleve.docx
@@ -652,7 +652,7 @@
         <w:t xml:space="preserve">InfraLab</w:t>
       </w:r>
       <w:r>
-        <w:t xml:space="preserve">. Le simulateur contient 46 TP guidés ; ce livret ajoute </w:t>
+        <w:t xml:space="preserve">. Le simulateur contient 48 TP guidés ; ce livret ajoute </w:t>
       </w:r>
       <w:r>
         <w:rPr>
@@ -1025,7 +1025,7 @@
               <w:spacing w:after="40" w:before="0" w:line="276"/>
             </w:pPr>
             <w:r>
-              <w:t xml:space="preserve">Une fiche par TP (46) : objectifs, question de transfert, journal</w:t>
+              <w:t xml:space="preserve">une fiche par TP (48) : objectifs, question de transfert, journal</w:t>
             </w:r>
           </w:p>
         </w:tc>
@@ -3371,7 +3371,7 @@
           <w:iCs/>
           <w:color w:val="595959"/>
         </w:rPr>
-        <w:t xml:space="preserve">TP associés : TP 11 à 15, 42.</w:t>
+        <w:t xml:space="preserve">TP associés : TP 11 à 15, 42, 47, 48.</w:t>
       </w:r>
     </w:p>
     <w:p>
@@ -4097,6 +4097,131 @@
     </w:p>
     <w:p>
       <w:pPr>
+        <w:pStyle w:val="Heading2"/>
+        <w:keepNext/>
+      </w:pPr>
+      <w:r>
+        <w:t xml:space="preserve">3.5 Escalader : passer la main ou prévenir</w:t>
+      </w:r>
+    </w:p>
+    <w:p>
+      <w:pPr>
+        <w:spacing w:after="120" w:before="0" w:line="276"/>
+      </w:pPr>
+      <w:r>
+        <w:t xml:space="preserve">Un support s'organise en </w:t>
+      </w:r>
+      <w:r>
+        <w:rPr>
+          <w:b/>
+          <w:bCs/>
+        </w:rPr>
+        <w:t xml:space="preserve">niveaux</w:t>
+      </w:r>
+      <w:r>
+        <w:t xml:space="preserve"> : </w:t>
+      </w:r>
+      <w:r>
+        <w:rPr>
+          <w:b/>
+          <w:bCs/>
+        </w:rPr>
+        <w:t xml:space="preserve">N1</w:t>
+      </w:r>
+      <w:r>
+        <w:t xml:space="preserve"> (service desk, cas courants), </w:t>
+      </w:r>
+      <w:r>
+        <w:rPr>
+          <w:b/>
+          <w:bCs/>
+        </w:rPr>
+        <w:t xml:space="preserve">N2</w:t>
+      </w:r>
+      <w:r>
+        <w:t xml:space="preserve"> (techniciens confirmés), </w:t>
+      </w:r>
+      <w:r>
+        <w:rPr>
+          <w:b/>
+          <w:bCs/>
+        </w:rPr>
+        <w:t xml:space="preserve">N3</w:t>
+      </w:r>
+      <w:r>
+        <w:t xml:space="preserve"> (experts, éditeurs, fournisseurs). L'</w:t>
+      </w:r>
+      <w:r>
+        <w:rPr>
+          <w:b/>
+          <w:bCs/>
+        </w:rPr>
+        <w:t xml:space="preserve">escalade fonctionnelle</w:t>
+      </w:r>
+      <w:r>
+        <w:t xml:space="preserve"> transfère le ticket au niveau supérieur quand on n'a pas la compétence, les droits ou le temps. L'</w:t>
+      </w:r>
+      <w:r>
+        <w:rPr>
+          <w:b/>
+          <w:bCs/>
+        </w:rPr>
+        <w:t xml:space="preserve">escalade hiérarchique</w:t>
+      </w:r>
+      <w:r>
+        <w:t xml:space="preserve"> </w:t>
+      </w:r>
+      <w:r>
+        <w:rPr>
+          <w:i/>
+          <w:iCs/>
+        </w:rPr>
+        <w:t xml:space="preserve">prévient un responsable</w:t>
+      </w:r>
+      <w:r>
+        <w:t xml:space="preserve"> pour qu'il décide ou arbitre : le ticket ne change pas de niveau.</w:t>
+      </w:r>
+    </w:p>
+    <w:p>
+      <w:pPr>
+        <w:spacing w:after="120" w:before="0" w:line="276"/>
+      </w:pPr>
+      <w:r>
+        <w:t xml:space="preserve">Une bonne escalade est </w:t>
+      </w:r>
+      <w:r>
+        <w:rPr>
+          <w:b/>
+          <w:bCs/>
+        </w:rPr>
+        <w:t xml:space="preserve">motivée</w:t>
+      </w:r>
+      <w:r>
+        <w:t xml:space="preserve"> (ce qui a été essayé, ce qui bloque), </w:t>
+      </w:r>
+      <w:r>
+        <w:rPr>
+          <w:b/>
+          <w:bCs/>
+        </w:rPr>
+        <w:t xml:space="preserve">tracée</w:t>
+      </w:r>
+      <w:r>
+        <w:t xml:space="preserve"> (qui, quand, vers qui) et </w:t>
+      </w:r>
+      <w:r>
+        <w:rPr>
+          <w:b/>
+          <w:bCs/>
+        </w:rPr>
+        <w:t xml:space="preserve">opportune</w:t>
+      </w:r>
+      <w:r>
+        <w:t xml:space="preserve"> : on escalade quand le SLA devient « à risque », pas après le dépassement. Une escalade hiérarchique se justifie par un enjeu (priorité 1 ou 2, SLA menacé) : alerter pour tout, c'est perdre la confiance du responsable.</w:t>
+      </w:r>
+    </w:p>
+    <w:p>
+      <w:pPr>
         <w:spacing w:after="100"/>
       </w:pPr>
     </w:p>
@@ -4196,6 +4321,19 @@
             </w:pPr>
             <w:r>
               <w:t xml:space="preserve">Résolu ≠ Clos.</w:t>
+            </w:r>
+          </w:p>
+          <w:p>
+            <w:pPr>
+              <w:pStyle w:val="ListParagraph"/>
+              <w:numPr>
+                <w:ilvl w:val="0"/>
+                <w:numId w:val="2"/>
+              </w:numPr>
+              <w:spacing w:after="60" w:line="276"/>
+            </w:pPr>
+            <w:r>
+              <w:t xml:space="preserve">Escalader tôt, avec un motif ; alerter le responsable seulement si l'enjeu le justifie.</w:t>
             </w:r>
           </w:p>
         </w:tc>
@@ -30973,6 +31111,734 @@
       </w:r>
       <w:r>
         <w:t xml:space="preserve"> Pourquoi le rôle d'administrateur ne doit-il pas se déléguer comme les autres ?</w:t>
+      </w:r>
+    </w:p>
+    <w:p>
+      <w:pPr>
+        <w:pBdr>
+          <w:bottom w:val="single" w:color="A6A6A6" w:sz="4" w:space="1"/>
+        </w:pBdr>
+        <w:spacing w:after="0" w:before="200"/>
+      </w:pPr>
+    </w:p>
+    <w:p>
+      <w:pPr>
+        <w:pBdr>
+          <w:bottom w:val="single" w:color="A6A6A6" w:sz="4" w:space="1"/>
+        </w:pBdr>
+        <w:spacing w:after="0" w:before="200"/>
+      </w:pPr>
+    </w:p>
+    <w:p>
+      <w:pPr>
+        <w:pBdr>
+          <w:bottom w:val="single" w:color="A6A6A6" w:sz="4" w:space="1"/>
+        </w:pBdr>
+        <w:spacing w:after="0" w:before="200"/>
+      </w:pPr>
+    </w:p>
+    <w:tbl>
+      <w:tblPr>
+        <w:tblW w:type="dxa" w:w="9026"/>
+        <w:tblBorders>
+          <w:top w:val="single" w:color="auto" w:sz="4"/>
+          <w:left w:val="single" w:color="auto" w:sz="4"/>
+          <w:bottom w:val="single" w:color="auto" w:sz="4"/>
+          <w:right w:val="single" w:color="auto" w:sz="4"/>
+          <w:insideH w:val="single" w:color="auto" w:sz="4"/>
+          <w:insideV w:val="single" w:color="auto" w:sz="4"/>
+        </w:tblBorders>
+      </w:tblPr>
+      <w:tblGrid>
+        <w:gridCol w:w="2400"/>
+        <w:gridCol w:w="2400"/>
+        <w:gridCol w:w="2226"/>
+        <w:gridCol w:w="2000"/>
+      </w:tblGrid>
+      <w:tr>
+        <w:trPr>
+          <w:cantSplit/>
+        </w:trPr>
+        <w:tc>
+          <w:tcPr>
+            <w:tcW w:type="dxa" w:w="2400"/>
+            <w:tcBorders>
+              <w:top w:val="single" w:color="BFBFBF" w:sz="4"/>
+              <w:left w:val="single" w:color="BFBFBF" w:sz="4"/>
+              <w:bottom w:val="single" w:color="BFBFBF" w:sz="4"/>
+              <w:right w:val="single" w:color="BFBFBF" w:sz="4"/>
+            </w:tcBorders>
+            <w:tcMar>
+              <w:top w:type="dxa" w:w="70"/>
+              <w:left w:type="dxa" w:w="110"/>
+              <w:bottom w:type="dxa" w:w="70"/>
+              <w:right w:type="dxa" w:w="110"/>
+            </w:tcMar>
+            <w:vAlign w:val="top"/>
+          </w:tcPr>
+          <w:p>
+            <w:pPr>
+              <w:spacing w:after="40" w:before="0" w:line="276"/>
+            </w:pPr>
+            <w:r>
+              <w:t xml:space="preserve">Score : ………… / 100</w:t>
+            </w:r>
+          </w:p>
+        </w:tc>
+        <w:tc>
+          <w:tcPr>
+            <w:tcW w:type="dxa" w:w="2400"/>
+            <w:tcBorders>
+              <w:top w:val="single" w:color="BFBFBF" w:sz="4"/>
+              <w:left w:val="single" w:color="BFBFBF" w:sz="4"/>
+              <w:bottom w:val="single" w:color="BFBFBF" w:sz="4"/>
+              <w:right w:val="single" w:color="BFBFBF" w:sz="4"/>
+            </w:tcBorders>
+            <w:tcMar>
+              <w:top w:type="dxa" w:w="70"/>
+              <w:left w:type="dxa" w:w="110"/>
+              <w:bottom w:type="dxa" w:w="70"/>
+              <w:right w:type="dxa" w:w="110"/>
+            </w:tcMar>
+            <w:vAlign w:val="top"/>
+          </w:tcPr>
+          <w:p>
+            <w:pPr>
+              <w:spacing w:after="40" w:before="0" w:line="276"/>
+            </w:pPr>
+            <w:r>
+              <w:t xml:space="preserve">Indices utilisés : …………</w:t>
+            </w:r>
+          </w:p>
+        </w:tc>
+        <w:tc>
+          <w:tcPr>
+            <w:tcW w:type="dxa" w:w="2226"/>
+            <w:tcBorders>
+              <w:top w:val="single" w:color="BFBFBF" w:sz="4"/>
+              <w:left w:val="single" w:color="BFBFBF" w:sz="4"/>
+              <w:bottom w:val="single" w:color="BFBFBF" w:sz="4"/>
+              <w:right w:val="single" w:color="BFBFBF" w:sz="4"/>
+            </w:tcBorders>
+            <w:tcMar>
+              <w:top w:type="dxa" w:w="70"/>
+              <w:left w:type="dxa" w:w="110"/>
+              <w:bottom w:type="dxa" w:w="70"/>
+              <w:right w:type="dxa" w:w="110"/>
+            </w:tcMar>
+            <w:vAlign w:val="top"/>
+          </w:tcPr>
+          <w:p>
+            <w:pPr>
+              <w:spacing w:after="40" w:before="0" w:line="276"/>
+            </w:pPr>
+            <w:r>
+              <w:t xml:space="preserve">Date : ………………</w:t>
+            </w:r>
+          </w:p>
+        </w:tc>
+        <w:tc>
+          <w:tcPr>
+            <w:tcW w:type="dxa" w:w="2000"/>
+            <w:tcBorders>
+              <w:top w:val="single" w:color="BFBFBF" w:sz="4"/>
+              <w:left w:val="single" w:color="BFBFBF" w:sz="4"/>
+              <w:bottom w:val="single" w:color="BFBFBF" w:sz="4"/>
+              <w:right w:val="single" w:color="BFBFBF" w:sz="4"/>
+            </w:tcBorders>
+            <w:tcMar>
+              <w:top w:type="dxa" w:w="70"/>
+              <w:left w:type="dxa" w:w="110"/>
+              <w:bottom w:type="dxa" w:w="70"/>
+              <w:right w:type="dxa" w:w="110"/>
+            </w:tcMar>
+            <w:vAlign w:val="top"/>
+          </w:tcPr>
+          <w:p>
+            <w:pPr>
+              <w:spacing w:after="40" w:before="0" w:line="276"/>
+            </w:pPr>
+            <w:r>
+              <w:t xml:space="preserve">Visa : …………</w:t>
+            </w:r>
+          </w:p>
+        </w:tc>
+      </w:tr>
+    </w:tbl>
+    <w:p>
+      <w:pPr>
+        <w:spacing w:after="160"/>
+      </w:pPr>
+    </w:p>
+    <w:p>
+      <w:pPr>
+        <w:pStyle w:val="Heading2"/>
+        <w:keepNext/>
+      </w:pPr>
+      <w:r>
+        <w:t xml:space="preserve">TP 47 — Passer la main : l'escalade fonctionnelle</w:t>
+      </w:r>
+    </w:p>
+    <w:p>
+      <w:pPr>
+        <w:keepNext/>
+        <w:spacing w:after="120" w:before="0" w:line="276"/>
+      </w:pPr>
+      <w:r>
+        <w:rPr>
+          <w:i/>
+          <w:iCs/>
+          <w:color w:val="595959"/>
+        </w:rPr>
+        <w:t xml:space="preserve">Service Desk · 40 min · difficulté ★★☆☆☆</w:t>
+      </w:r>
+    </w:p>
+    <w:p>
+      <w:pPr>
+        <w:keepNext/>
+        <w:spacing w:after="120" w:before="0" w:line="276"/>
+      </w:pPr>
+      <w:r>
+        <w:rPr>
+          <w:b/>
+          <w:bCs/>
+        </w:rPr>
+        <w:t xml:space="preserve">Contexte.</w:t>
+      </w:r>
+      <w:r>
+        <w:t xml:space="preserve"> Alice (Comptabilité) ne peut plus ouvrir le partage de fichiers de la compta : « Accès refusé, je suis bloquée pour la clôture ». Le service desk de niveau 1 (David) reprend l'appel. Le niveau 2 (Samir Haddad, groupe « Support N2 ») est joignable. À vous de décider quand passer la main, et comment.</w:t>
+      </w:r>
+    </w:p>
+    <w:p>
+      <w:pPr>
+        <w:keepNext/>
+        <w:spacing w:after="120" w:before="0" w:line="276"/>
+      </w:pPr>
+      <w:r>
+        <w:rPr>
+          <w:b/>
+          <w:bCs/>
+          <w:color w:val="7A4A00"/>
+        </w:rPr>
+        <w:t xml:space="preserve">Horloge.</w:t>
+      </w:r>
+      <w:r>
+        <w:rPr>
+          <w:color w:val="7A4A00"/>
+        </w:rPr>
+        <w:t xml:space="preserve"> Ce TP se joue sur la durée : un incident dure quand on n'arrive pas à le résoudre. Cliquez sur « +1 h » sept fois (soit 7 h de temps simulé) pour que le SLA devienne « À risque », puis escaladez.</w:t>
+      </w:r>
+    </w:p>
+    <w:p>
+      <w:pPr>
+        <w:keepNext/>
+        <w:spacing w:after="40" w:before="0" w:line="276"/>
+      </w:pPr>
+      <w:r>
+        <w:rPr>
+          <w:b/>
+          <w:bCs/>
+        </w:rPr>
+        <w:t xml:space="preserve">Objectifs du TP</w:t>
+      </w:r>
+    </w:p>
+    <w:p>
+      <w:pPr>
+        <w:pStyle w:val="ListParagraph"/>
+        <w:numPr>
+          <w:ilvl w:val="0"/>
+          <w:numId w:val="2"/>
+        </w:numPr>
+        <w:spacing w:after="60" w:line="276"/>
+      </w:pPr>
+      <w:r>
+        <w:t xml:space="preserve">Distinguer les deux types d'escalade</w:t>
+      </w:r>
+    </w:p>
+    <w:p>
+      <w:pPr>
+        <w:pStyle w:val="ListParagraph"/>
+        <w:numPr>
+          <w:ilvl w:val="0"/>
+          <w:numId w:val="2"/>
+        </w:numPr>
+        <w:spacing w:after="60" w:line="276"/>
+      </w:pPr>
+      <w:r>
+        <w:t xml:space="preserve">INC-0001 est qualifié P2, attribué à David et pris en charge, avec un commentaire</w:t>
+      </w:r>
+    </w:p>
+    <w:p>
+      <w:pPr>
+        <w:pStyle w:val="ListParagraph"/>
+        <w:numPr>
+          <w:ilvl w:val="0"/>
+          <w:numId w:val="2"/>
+        </w:numPr>
+        <w:spacing w:after="60" w:line="276"/>
+      </w:pPr>
+      <w:r>
+        <w:t xml:space="preserve">Le temps a passé : 7 h se sont écoulées (utilisez « +1 h »)</w:t>
+      </w:r>
+    </w:p>
+    <w:p>
+      <w:pPr>
+        <w:pStyle w:val="ListParagraph"/>
+        <w:numPr>
+          <w:ilvl w:val="0"/>
+          <w:numId w:val="2"/>
+        </w:numPr>
+        <w:spacing w:after="60" w:line="276"/>
+      </w:pPr>
+      <w:r>
+        <w:t xml:space="preserve">Choisir le bon moment pour escalader</w:t>
+      </w:r>
+    </w:p>
+    <w:p>
+      <w:pPr>
+        <w:pStyle w:val="ListParagraph"/>
+        <w:numPr>
+          <w:ilvl w:val="0"/>
+          <w:numId w:val="2"/>
+        </w:numPr>
+        <w:spacing w:after="60" w:line="276"/>
+      </w:pPr>
+      <w:r>
+        <w:t xml:space="preserve">INC-0001 est escaladé au niveau 2, vers « Support N2 »</w:t>
+      </w:r>
+    </w:p>
+    <w:p>
+      <w:pPr>
+        <w:pStyle w:val="ListParagraph"/>
+        <w:numPr>
+          <w:ilvl w:val="0"/>
+          <w:numId w:val="2"/>
+        </w:numPr>
+        <w:spacing w:after="60" w:line="276"/>
+      </w:pPr>
+      <w:r>
+        <w:t xml:space="preserve">Le ticket est au niveau de support 2</w:t>
+      </w:r>
+    </w:p>
+    <w:p>
+      <w:pPr>
+        <w:pStyle w:val="ListParagraph"/>
+        <w:numPr>
+          <w:ilvl w:val="0"/>
+          <w:numId w:val="2"/>
+        </w:numPr>
+        <w:spacing w:after="60" w:line="276"/>
+      </w:pPr>
+      <w:r>
+        <w:t xml:space="preserve">Samir (niveau 2) a repris le ticket</w:t>
+      </w:r>
+    </w:p>
+    <w:p>
+      <w:pPr>
+        <w:pStyle w:val="ListParagraph"/>
+        <w:numPr>
+          <w:ilvl w:val="0"/>
+          <w:numId w:val="2"/>
+        </w:numPr>
+        <w:spacing w:after="60" w:line="276"/>
+      </w:pPr>
+      <w:r>
+        <w:t xml:space="preserve">INC-0001 est résolu avec une solution documentée</w:t>
+      </w:r>
+    </w:p>
+    <w:p>
+      <w:pPr>
+        <w:spacing w:after="120" w:before="80" w:line="276"/>
+      </w:pPr>
+      <w:r>
+        <w:rPr>
+          <w:b/>
+          <w:bCs/>
+        </w:rPr>
+        <w:t xml:space="preserve">Compétence concernée :</w:t>
+      </w:r>
+      <w:r>
+        <w:t xml:space="preserve"> Répondre aux incidents et aux demandes (compétence travaillée) ; Exploiter et dépanner (compétence travaillée).</w:t>
+      </w:r>
+    </w:p>
+    <w:p>
+      <w:pPr>
+        <w:keepNext/>
+        <w:spacing w:after="120" w:before="80" w:line="276"/>
+      </w:pPr>
+      <w:r>
+        <w:rPr>
+          <w:b/>
+          <w:bCs/>
+        </w:rPr>
+        <w:t xml:space="preserve">Pour aller plus loin.</w:t>
+      </w:r>
+      <w:r>
+        <w:t xml:space="preserve"> Un technicien de niveau 1 garde un ticket « pour ne pas déranger » jusqu'à ce que le SLA soit dépassé. Que lui dites-vous ?</w:t>
+      </w:r>
+    </w:p>
+    <w:p>
+      <w:pPr>
+        <w:pBdr>
+          <w:bottom w:val="single" w:color="A6A6A6" w:sz="4" w:space="1"/>
+        </w:pBdr>
+        <w:spacing w:after="0" w:before="200"/>
+      </w:pPr>
+    </w:p>
+    <w:p>
+      <w:pPr>
+        <w:pBdr>
+          <w:bottom w:val="single" w:color="A6A6A6" w:sz="4" w:space="1"/>
+        </w:pBdr>
+        <w:spacing w:after="0" w:before="200"/>
+      </w:pPr>
+    </w:p>
+    <w:p>
+      <w:pPr>
+        <w:pBdr>
+          <w:bottom w:val="single" w:color="A6A6A6" w:sz="4" w:space="1"/>
+        </w:pBdr>
+        <w:spacing w:after="0" w:before="200"/>
+      </w:pPr>
+    </w:p>
+    <w:tbl>
+      <w:tblPr>
+        <w:tblW w:type="dxa" w:w="9026"/>
+        <w:tblBorders>
+          <w:top w:val="single" w:color="auto" w:sz="4"/>
+          <w:left w:val="single" w:color="auto" w:sz="4"/>
+          <w:bottom w:val="single" w:color="auto" w:sz="4"/>
+          <w:right w:val="single" w:color="auto" w:sz="4"/>
+          <w:insideH w:val="single" w:color="auto" w:sz="4"/>
+          <w:insideV w:val="single" w:color="auto" w:sz="4"/>
+        </w:tblBorders>
+      </w:tblPr>
+      <w:tblGrid>
+        <w:gridCol w:w="2400"/>
+        <w:gridCol w:w="2400"/>
+        <w:gridCol w:w="2226"/>
+        <w:gridCol w:w="2000"/>
+      </w:tblGrid>
+      <w:tr>
+        <w:trPr>
+          <w:cantSplit/>
+        </w:trPr>
+        <w:tc>
+          <w:tcPr>
+            <w:tcW w:type="dxa" w:w="2400"/>
+            <w:tcBorders>
+              <w:top w:val="single" w:color="BFBFBF" w:sz="4"/>
+              <w:left w:val="single" w:color="BFBFBF" w:sz="4"/>
+              <w:bottom w:val="single" w:color="BFBFBF" w:sz="4"/>
+              <w:right w:val="single" w:color="BFBFBF" w:sz="4"/>
+            </w:tcBorders>
+            <w:tcMar>
+              <w:top w:type="dxa" w:w="70"/>
+              <w:left w:type="dxa" w:w="110"/>
+              <w:bottom w:type="dxa" w:w="70"/>
+              <w:right w:type="dxa" w:w="110"/>
+            </w:tcMar>
+            <w:vAlign w:val="top"/>
+          </w:tcPr>
+          <w:p>
+            <w:pPr>
+              <w:spacing w:after="40" w:before="0" w:line="276"/>
+            </w:pPr>
+            <w:r>
+              <w:t xml:space="preserve">Score : ………… / 100</w:t>
+            </w:r>
+          </w:p>
+        </w:tc>
+        <w:tc>
+          <w:tcPr>
+            <w:tcW w:type="dxa" w:w="2400"/>
+            <w:tcBorders>
+              <w:top w:val="single" w:color="BFBFBF" w:sz="4"/>
+              <w:left w:val="single" w:color="BFBFBF" w:sz="4"/>
+              <w:bottom w:val="single" w:color="BFBFBF" w:sz="4"/>
+              <w:right w:val="single" w:color="BFBFBF" w:sz="4"/>
+            </w:tcBorders>
+            <w:tcMar>
+              <w:top w:type="dxa" w:w="70"/>
+              <w:left w:type="dxa" w:w="110"/>
+              <w:bottom w:type="dxa" w:w="70"/>
+              <w:right w:type="dxa" w:w="110"/>
+            </w:tcMar>
+            <w:vAlign w:val="top"/>
+          </w:tcPr>
+          <w:p>
+            <w:pPr>
+              <w:spacing w:after="40" w:before="0" w:line="276"/>
+            </w:pPr>
+            <w:r>
+              <w:t xml:space="preserve">Indices utilisés : …………</w:t>
+            </w:r>
+          </w:p>
+        </w:tc>
+        <w:tc>
+          <w:tcPr>
+            <w:tcW w:type="dxa" w:w="2226"/>
+            <w:tcBorders>
+              <w:top w:val="single" w:color="BFBFBF" w:sz="4"/>
+              <w:left w:val="single" w:color="BFBFBF" w:sz="4"/>
+              <w:bottom w:val="single" w:color="BFBFBF" w:sz="4"/>
+              <w:right w:val="single" w:color="BFBFBF" w:sz="4"/>
+            </w:tcBorders>
+            <w:tcMar>
+              <w:top w:type="dxa" w:w="70"/>
+              <w:left w:type="dxa" w:w="110"/>
+              <w:bottom w:type="dxa" w:w="70"/>
+              <w:right w:type="dxa" w:w="110"/>
+            </w:tcMar>
+            <w:vAlign w:val="top"/>
+          </w:tcPr>
+          <w:p>
+            <w:pPr>
+              <w:spacing w:after="40" w:before="0" w:line="276"/>
+            </w:pPr>
+            <w:r>
+              <w:t xml:space="preserve">Date : ………………</w:t>
+            </w:r>
+          </w:p>
+        </w:tc>
+        <w:tc>
+          <w:tcPr>
+            <w:tcW w:type="dxa" w:w="2000"/>
+            <w:tcBorders>
+              <w:top w:val="single" w:color="BFBFBF" w:sz="4"/>
+              <w:left w:val="single" w:color="BFBFBF" w:sz="4"/>
+              <w:bottom w:val="single" w:color="BFBFBF" w:sz="4"/>
+              <w:right w:val="single" w:color="BFBFBF" w:sz="4"/>
+            </w:tcBorders>
+            <w:tcMar>
+              <w:top w:type="dxa" w:w="70"/>
+              <w:left w:type="dxa" w:w="110"/>
+              <w:bottom w:type="dxa" w:w="70"/>
+              <w:right w:type="dxa" w:w="110"/>
+            </w:tcMar>
+            <w:vAlign w:val="top"/>
+          </w:tcPr>
+          <w:p>
+            <w:pPr>
+              <w:spacing w:after="40" w:before="0" w:line="276"/>
+            </w:pPr>
+            <w:r>
+              <w:t xml:space="preserve">Visa : …………</w:t>
+            </w:r>
+          </w:p>
+        </w:tc>
+      </w:tr>
+    </w:tbl>
+    <w:p>
+      <w:pPr>
+        <w:spacing w:after="160"/>
+      </w:pPr>
+    </w:p>
+    <w:p>
+      <w:pPr>
+        <w:pStyle w:val="Heading2"/>
+        <w:keepNext/>
+      </w:pPr>
+      <w:r>
+        <w:t xml:space="preserve">TP 48 — Prévenir le responsable : l'escalade hiérarchique</w:t>
+      </w:r>
+    </w:p>
+    <w:p>
+      <w:pPr>
+        <w:keepNext/>
+        <w:spacing w:after="120" w:before="0" w:line="276"/>
+      </w:pPr>
+      <w:r>
+        <w:rPr>
+          <w:i/>
+          <w:iCs/>
+          <w:color w:val="595959"/>
+        </w:rPr>
+        <w:t xml:space="preserve">Service Desk · 40 min · difficulté ★★★☆☆</w:t>
+      </w:r>
+    </w:p>
+    <w:p>
+      <w:pPr>
+        <w:keepNext/>
+        <w:spacing w:after="120" w:before="0" w:line="276"/>
+      </w:pPr>
+      <w:r>
+        <w:rPr>
+          <w:b/>
+          <w:bCs/>
+        </w:rPr>
+        <w:t xml:space="preserve">Contexte.</w:t>
+      </w:r>
+      <w:r>
+        <w:t xml:space="preserve"> Deux tickets sont arrivés ce matin. Éric Moreau (Direction) ne peut plus émettre les factures clients : l'activité est à l'arrêt. Bruno (Comptabilité) signale une souris qui se déconnecte. Il y a un responsable, Éric lui-même, à informer quand l'enjeu le justifie.</w:t>
+      </w:r>
+    </w:p>
+    <w:p>
+      <w:pPr>
+        <w:keepNext/>
+        <w:spacing w:after="120" w:before="0" w:line="276"/>
+      </w:pPr>
+      <w:r>
+        <w:rPr>
+          <w:b/>
+          <w:bCs/>
+          <w:color w:val="7A4A00"/>
+        </w:rPr>
+        <w:t xml:space="preserve">Horloge.</w:t>
+      </w:r>
+      <w:r>
+        <w:rPr>
+          <w:color w:val="7A4A00"/>
+        </w:rPr>
+        <w:t xml:space="preserve"> Le SLA d'un ticket P1 est de 4 h pour résoudre. Cliquez sur « +1 h » trois fois (3 h simulées) : le SLA devient « À risque » et l'escalade hiérarchique se justifie.</w:t>
+      </w:r>
+    </w:p>
+    <w:p>
+      <w:pPr>
+        <w:keepNext/>
+        <w:spacing w:after="40" w:before="0" w:line="276"/>
+      </w:pPr>
+      <w:r>
+        <w:rPr>
+          <w:b/>
+          <w:bCs/>
+        </w:rPr>
+        <w:t xml:space="preserve">Objectifs du TP</w:t>
+      </w:r>
+    </w:p>
+    <w:p>
+      <w:pPr>
+        <w:pStyle w:val="ListParagraph"/>
+        <w:numPr>
+          <w:ilvl w:val="0"/>
+          <w:numId w:val="2"/>
+        </w:numPr>
+        <w:spacing w:after="60" w:line="276"/>
+      </w:pPr>
+      <w:r>
+        <w:t xml:space="preserve">Comprendre à quoi sert l'escalade hiérarchique</w:t>
+      </w:r>
+    </w:p>
+    <w:p>
+      <w:pPr>
+        <w:pStyle w:val="ListParagraph"/>
+        <w:numPr>
+          <w:ilvl w:val="0"/>
+          <w:numId w:val="2"/>
+        </w:numPr>
+        <w:spacing w:after="60" w:line="276"/>
+      </w:pPr>
+      <w:r>
+        <w:t xml:space="preserve">INC-0001 est P1 et INC-0002 est P4, tous deux pris en charge</w:t>
+      </w:r>
+    </w:p>
+    <w:p>
+      <w:pPr>
+        <w:pStyle w:val="ListParagraph"/>
+        <w:numPr>
+          <w:ilvl w:val="0"/>
+          <w:numId w:val="2"/>
+        </w:numPr>
+        <w:spacing w:after="60" w:line="276"/>
+      </w:pPr>
+      <w:r>
+        <w:t xml:space="preserve">Trois heures se sont écoulées (utilisez « +1 h »)</w:t>
+      </w:r>
+    </w:p>
+    <w:p>
+      <w:pPr>
+        <w:pStyle w:val="ListParagraph"/>
+        <w:numPr>
+          <w:ilvl w:val="0"/>
+          <w:numId w:val="2"/>
+        </w:numPr>
+        <w:spacing w:after="60" w:line="276"/>
+      </w:pPr>
+      <w:r>
+        <w:t xml:space="preserve">Expliquer pourquoi INC-0002 n'est pas alerté</w:t>
+      </w:r>
+    </w:p>
+    <w:p>
+      <w:pPr>
+        <w:pStyle w:val="ListParagraph"/>
+        <w:numPr>
+          <w:ilvl w:val="0"/>
+          <w:numId w:val="2"/>
+        </w:numPr>
+        <w:spacing w:after="60" w:line="276"/>
+      </w:pPr>
+      <w:r>
+        <w:t xml:space="preserve">Le responsable est alerté pour INC-0001</w:t>
+      </w:r>
+    </w:p>
+    <w:p>
+      <w:pPr>
+        <w:pStyle w:val="ListParagraph"/>
+        <w:numPr>
+          <w:ilvl w:val="0"/>
+          <w:numId w:val="2"/>
+        </w:numPr>
+        <w:spacing w:after="60" w:line="276"/>
+      </w:pPr>
+      <w:r>
+        <w:t xml:space="preserve">INC-0001 reste au niveau 1 (on a alerté, pas transféré)</w:t>
+      </w:r>
+    </w:p>
+    <w:p>
+      <w:pPr>
+        <w:pStyle w:val="ListParagraph"/>
+        <w:numPr>
+          <w:ilvl w:val="0"/>
+          <w:numId w:val="2"/>
+        </w:numPr>
+        <w:spacing w:after="60" w:line="276"/>
+      </w:pPr>
+      <w:r>
+        <w:t xml:space="preserve">Éric Moreau, responsable, a laissé une instruction (commentaire)</w:t>
+      </w:r>
+    </w:p>
+    <w:p>
+      <w:pPr>
+        <w:pStyle w:val="ListParagraph"/>
+        <w:numPr>
+          <w:ilvl w:val="0"/>
+          <w:numId w:val="2"/>
+        </w:numPr>
+        <w:spacing w:after="60" w:line="276"/>
+      </w:pPr>
+      <w:r>
+        <w:t xml:space="preserve">INC-0001 est résolu avec une solution documentée</w:t>
+      </w:r>
+    </w:p>
+    <w:p>
+      <w:pPr>
+        <w:spacing w:after="120" w:before="80" w:line="276"/>
+      </w:pPr>
+      <w:r>
+        <w:rPr>
+          <w:b/>
+          <w:bCs/>
+        </w:rPr>
+        <w:t xml:space="preserve">Compétence concernée :</w:t>
+      </w:r>
+      <w:r>
+        <w:t xml:space="preserve"> Répondre aux incidents et aux demandes (compétence travaillée) ; Gérer les habilitations (élément de preuve possible).</w:t>
+      </w:r>
+    </w:p>
+    <w:p>
+      <w:pPr>
+        <w:keepNext/>
+        <w:spacing w:after="120" w:before="80" w:line="276"/>
+      </w:pPr>
+      <w:r>
+        <w:rPr>
+          <w:b/>
+          <w:bCs/>
+        </w:rPr>
+        <w:t xml:space="preserve">Pour aller plus loin.</w:t>
+      </w:r>
+      <w:r>
+        <w:t xml:space="preserve"> Le responsable reçoit dix alertes par jour, toutes en priorité 4. Qu'en résulte-t-il, et comment l'éviter ?</w:t>
       </w:r>
     </w:p>
     <w:p>

</xml_diff>